<commit_message>
Update consolidated NI-RADS guide with ACR templates, legends, and Atlas
Add ACR report templates (CECT, face/sinus MRI), PET/no-PET legends,
2018 committee surveillance schedule, NI-RADS Atlas lexicon, pearls
and cases; resolve CECT/MRI-alone discrete mass rule via legend.

Co-Authored-By: Claude Opus 5.5 <noreply@anthropic.com>
Claude-Session: https://claude.ai/code/session_01BFw33Wx8x4pvzxSmHNQ5Pv
</commit_message>
<xml_diff>
--- a/NI-RADS_통합_학습자료.docx
+++ b/NI-RADS_통합_학습자료.docx
@@ -51,7 +51,7 @@
           <w:color w:val="A03030"/>
           <w:sz w:val="17"/>
         </w:rPr>
-        <w:t>※ 근거: 사용자가 제공한 ACR 공식 PDF 6종 + PubMed/PMC 문헌. ACR 원문에 없는 해석은 [해설]로, 확인하지 못한 부분은 [미확인]으로 표시했습니다. 증례는 모두 교육용 가상 증례입니다. acr.org·JACR 본문·YouTube 강의는 작성 환경에서 접속이 차단되어 반영하지 못했습니다.</w:t>
+        <w:t>※ 근거: ACR NI-RADS 공식 사이트 자료(분류표·알고리즘 PDF, NI-RADS Atlas, 보고서 템플릿·legend, 2018 Committee 추적 권고), 리뷰 2편(Zander 2026, Vertulli 2025), PubMed/PMC 문헌. ACR 원문에 없는 해석은 [해설]로, 확인하지 못한 부분은 [미확인]으로 표시했습니다. 증례는 모두 교육용 가상 증례입니다. acr.org·JACR 본문·YouTube 강의는 작성 환경에서 접속이 차단되어 반영하지 못했습니다.</w:t>
       </w:r>
     </w:p>
     <w:p>
@@ -345,7 +345,7 @@
           <w:i w:val="0"/>
           <w:sz w:val="19"/>
         </w:rPr>
-        <w:t xml:space="preserve">  23. 자가점검 퀴즈 (O/X 20문항)</w:t>
+        <w:t xml:space="preserve">  23. 자가점검 퀴즈 (O/X 24문항)</w:t>
       </w:r>
     </w:p>
     <w:p>
@@ -365,6 +365,36 @@
           <w:i w:val="0"/>
           <w:sz w:val="19"/>
         </w:rPr>
+        <w:t>PART E-2. Atlas와 템플릿</w:t>
+      </w:r>
+    </w:p>
+    <w:p>
+      <w:r>
+        <w:rPr>
+          <w:b w:val="0"/>
+          <w:i w:val="0"/>
+          <w:sz w:val="19"/>
+        </w:rPr>
+        <w:t xml:space="preserve">  25. 보고서 템플릿과 Legend (PET 유무별)</w:t>
+      </w:r>
+    </w:p>
+    <w:p>
+      <w:r>
+        <w:rPr>
+          <w:b w:val="0"/>
+          <w:i w:val="0"/>
+          <w:sz w:val="19"/>
+        </w:rPr>
+        <w:t xml:space="preserve">  26. NI-RADS Atlas 핵심 정리와 증례</w:t>
+      </w:r>
+    </w:p>
+    <w:p>
+      <w:r>
+        <w:rPr>
+          <w:b/>
+          <w:i w:val="0"/>
+          <w:sz w:val="19"/>
+        </w:rPr>
         <w:t>PART F. 근거와 요약</w:t>
       </w:r>
     </w:p>
@@ -375,7 +405,7 @@
           <w:i w:val="0"/>
           <w:sz w:val="19"/>
         </w:rPr>
-        <w:t xml:space="preserve">  25. 근거 문헌 요약</w:t>
+        <w:t xml:space="preserve">  27. 근거 문헌 요약</w:t>
       </w:r>
     </w:p>
     <w:p>
@@ -385,7 +415,7 @@
           <w:i w:val="0"/>
           <w:sz w:val="19"/>
         </w:rPr>
-        <w:t xml:space="preserve">  26. 한 장 요약표</w:t>
+        <w:t xml:space="preserve">  28. 한 장 요약표</w:t>
       </w:r>
     </w:p>
     <w:p>
@@ -801,7 +831,7 @@
           <w:color w:val="666666"/>
           <w:sz w:val="17"/>
         </w:rPr>
-        <w:t>출처: Aiken 2016 (PMID 26577876); Aiken 2018 White Paper (PMID 29983244); Bunch 2025 JACR (PMID 40754125); ACR NI-RADS™ PET/CT Category Descriptors, Imaging Findings, and Management (Jan 2021); ACR NI-RADS™ MRI v2025 Assessment Categories (Aug 2025); Vertulli et al. Bioengineering 2025 (doi:10.3390/bioengineering12040398)</w:t>
+        <w:t>출처: Aiken 2016 (PMID 26577876); Aiken 2018 White Paper (PMID 29983244); Bunch 2025 JACR (PMID 40754125); ACR NI-RADS™ PET/CT Category Descriptors, Imaging Findings, and Management (Jan 2021); ACR NI-RADS™ MRI v2025 Assessment Categories (Aug 2025); Vertulli D, Parillo M, Mallio CA. Bioengineering 2025 (doi:10.3390/bioengineering12040398)</w:t>
       </w:r>
     </w:p>
     <w:p>
@@ -967,7 +997,7 @@
               <w:rPr>
                 <w:sz w:val="18"/>
               </w:rPr>
-              <w:t>Cancer Imaging 2026 리뷰 (doi:10.1186/s40644-026-00989-y)</w:t>
+              <w:t>Zander DA, Aiken AH, ... Bunch PM. Cancer Imaging 2026 리뷰 (doi:10.1186/s40644-026-00989-y)</w:t>
             </w:r>
           </w:p>
         </w:tc>
@@ -1012,7 +1042,7 @@
               <w:rPr>
                 <w:sz w:val="18"/>
               </w:rPr>
-              <w:t>Cancer Imaging 2026 리뷰 (doi:10.1186/s40644-026-00989-y)</w:t>
+              <w:t>Zander DA, Aiken AH, ... Bunch PM. Cancer Imaging 2026 리뷰 (doi:10.1186/s40644-026-00989-y)</w:t>
             </w:r>
           </w:p>
         </w:tc>
@@ -1483,7 +1513,7 @@
           <w:color w:val="666666"/>
           <w:sz w:val="17"/>
         </w:rPr>
-        <w:t>출처: ACR NI-RADS™ PET/CT Category Descriptors, Imaging Findings, and Management (Jan 2021); Hsu 2021 Radiol Imaging Cancer (doi:10.1148/rycan.2021200131); Cancer Imaging 2026 리뷰 (doi:10.1186/s40644-026-00989-y)</w:t>
+        <w:t>출처: ACR NI-RADS™ PET/CT Category Descriptors, Imaging Findings, and Management (Jan 2021); Hsu 2021 Radiol Imaging Cancer (doi:10.1148/rycan.2021200131); Zander DA, Aiken AH, ... Bunch PM. Cancer Imaging 2026 리뷰 (doi:10.1186/s40644-026-00989-y)</w:t>
       </w:r>
     </w:p>
     <w:p>
@@ -1562,7 +1592,274 @@
           <w:color w:val="666666"/>
           <w:sz w:val="17"/>
         </w:rPr>
-        <w:t>출처: Cancer Imaging 2026 리뷰 (doi:10.1186/s40644-026-00989-y); ACR NI-RADS Primary Site / Neck Nodes Category and Management 알고리즘 (PET/CT) 각주 2</w:t>
+        <w:t>출처: Zander DA, Aiken AH, ... Bunch PM. Cancer Imaging 2026 리뷰 (doi:10.1186/s40644-026-00989-y); ACR NI-RADS Primary Site / Neck Nodes Category and Management 알고리즘 (PET/CT) 각주 2</w:t>
+      </w:r>
+    </w:p>
+    <w:p>
+      <w:pPr>
+        <w:spacing w:before="160"/>
+      </w:pPr>
+      <w:r>
+        <w:rPr>
+          <w:b/>
+          <w:i w:val="0"/>
+          <w:color w:val="1F3A5F"/>
+          <w:sz w:val="23"/>
+        </w:rPr>
+        <w:t>5-1-1. ACR NI-RADS Committee 2018 추적 권고 (MRI 적용 포함)</w:t>
+      </w:r>
+    </w:p>
+    <w:tbl>
+      <w:tblPr>
+        <w:tblStyle w:val="TableGrid"/>
+        <w:tblW w:type="auto" w:w="0"/>
+        <w:tblLook w:firstColumn="1" w:firstRow="1" w:lastColumn="0" w:lastRow="0" w:noHBand="0" w:noVBand="1" w:val="04A0"/>
+      </w:tblPr>
+      <w:tblGrid>
+        <w:gridCol w:w="4986"/>
+        <w:gridCol w:w="4986"/>
+      </w:tblGrid>
+      <w:tr>
+        <w:tc>
+          <w:tcPr>
+            <w:tcW w:type="dxa" w:w="850"/>
+            <w:shd w:val="clear" w:color="auto" w:fill="1F3A5F"/>
+          </w:tcPr>
+          <w:p>
+            <w:r/>
+            <w:r>
+              <w:rPr>
+                <w:b/>
+                <w:color w:val="FFFFFF"/>
+                <w:sz w:val="18"/>
+              </w:rPr>
+              <w:t>단계</w:t>
+            </w:r>
+          </w:p>
+        </w:tc>
+        <w:tc>
+          <w:tcPr>
+            <w:tcW w:type="dxa" w:w="8787"/>
+            <w:shd w:val="clear" w:color="auto" w:fill="1F3A5F"/>
+          </w:tcPr>
+          <w:p>
+            <w:r/>
+            <w:r>
+              <w:rPr>
+                <w:b/>
+                <w:color w:val="FFFFFF"/>
+                <w:sz w:val="18"/>
+              </w:rPr>
+              <w:t>권고</w:t>
+            </w:r>
+          </w:p>
+        </w:tc>
+      </w:tr>
+      <w:tr>
+        <w:tc>
+          <w:tcPr>
+            <w:tcW w:type="dxa" w:w="850"/>
+          </w:tcPr>
+          <w:p>
+            <w:r/>
+            <w:r>
+              <w:rPr>
+                <w:b/>
+                <w:sz w:val="18"/>
+              </w:rPr>
+              <w:t>1</w:t>
+            </w:r>
+          </w:p>
+        </w:tc>
+        <w:tc>
+          <w:tcPr>
+            <w:tcW w:type="dxa" w:w="8787"/>
+          </w:tcPr>
+          <w:p>
+            <w:r/>
+            <w:r>
+              <w:rPr>
+                <w:sz w:val="18"/>
+              </w:rPr>
+              <w:t>근치적 치료 종료 후 8–12주: PET + CECT* → post-treatment baseline</w:t>
+            </w:r>
+          </w:p>
+        </w:tc>
+      </w:tr>
+      <w:tr>
+        <w:tc>
+          <w:tcPr>
+            <w:tcW w:type="dxa" w:w="850"/>
+          </w:tcPr>
+          <w:p>
+            <w:r/>
+            <w:r>
+              <w:rPr>
+                <w:b/>
+                <w:sz w:val="18"/>
+              </w:rPr>
+              <w:t>2</w:t>
+            </w:r>
+          </w:p>
+        </w:tc>
+        <w:tc>
+          <w:tcPr>
+            <w:tcW w:type="dxa" w:w="8787"/>
+          </w:tcPr>
+          <w:p>
+            <w:r/>
+            <w:r>
+              <w:rPr>
+                <w:sz w:val="18"/>
+              </w:rPr>
+              <w:t>8–12주 영상이 음성이면 6개월 후 CECT* 단독 또는 PET + CECT*</w:t>
+            </w:r>
+          </w:p>
+        </w:tc>
+      </w:tr>
+      <w:tr>
+        <w:tc>
+          <w:tcPr>
+            <w:tcW w:type="dxa" w:w="850"/>
+          </w:tcPr>
+          <w:p>
+            <w:r/>
+            <w:r>
+              <w:rPr>
+                <w:b/>
+                <w:sz w:val="18"/>
+              </w:rPr>
+              <w:t>2a</w:t>
+            </w:r>
+          </w:p>
+        </w:tc>
+        <w:tc>
+          <w:tcPr>
+            <w:tcW w:type="dxa" w:w="8787"/>
+          </w:tcPr>
+          <w:p>
+            <w:r/>
+            <w:r>
+              <w:rPr>
+                <w:sz w:val="18"/>
+              </w:rPr>
+              <w:t>6개월 CECT* 단독이 음성 → 6개월 후 CECT* 재검</w:t>
+            </w:r>
+          </w:p>
+        </w:tc>
+      </w:tr>
+      <w:tr>
+        <w:tc>
+          <w:tcPr>
+            <w:tcW w:type="dxa" w:w="850"/>
+          </w:tcPr>
+          <w:p>
+            <w:r/>
+            <w:r>
+              <w:rPr>
+                <w:b/>
+                <w:sz w:val="18"/>
+              </w:rPr>
+              <w:t>2b</w:t>
+            </w:r>
+          </w:p>
+        </w:tc>
+        <w:tc>
+          <w:tcPr>
+            <w:tcW w:type="dxa" w:w="8787"/>
+          </w:tcPr>
+          <w:p>
+            <w:r/>
+            <w:r>
+              <w:rPr>
+                <w:sz w:val="18"/>
+              </w:rPr>
+              <w:t>6개월 PET + CECT*가 모두 음성 → 추가 surveillance 영상 불필요</w:t>
+            </w:r>
+          </w:p>
+        </w:tc>
+      </w:tr>
+      <w:tr>
+        <w:tc>
+          <w:tcPr>
+            <w:tcW w:type="dxa" w:w="850"/>
+          </w:tcPr>
+          <w:p>
+            <w:r/>
+            <w:r>
+              <w:rPr>
+                <w:b/>
+                <w:sz w:val="18"/>
+              </w:rPr>
+              <w:t>3</w:t>
+            </w:r>
+          </w:p>
+        </w:tc>
+        <w:tc>
+          <w:tcPr>
+            <w:tcW w:type="dxa" w:w="8787"/>
+          </w:tcPr>
+          <w:p>
+            <w:r/>
+            <w:r>
+              <w:rPr>
+                <w:sz w:val="18"/>
+              </w:rPr>
+              <w:t>12개월 CECT* 단독이 음성 → 12개월 후 CECT* neck + chest</w:t>
+            </w:r>
+          </w:p>
+        </w:tc>
+      </w:tr>
+      <w:tr>
+        <w:tc>
+          <w:tcPr>
+            <w:tcW w:type="dxa" w:w="850"/>
+          </w:tcPr>
+          <w:p>
+            <w:r/>
+            <w:r>
+              <w:rPr>
+                <w:b/>
+                <w:sz w:val="18"/>
+              </w:rPr>
+              <w:t>*</w:t>
+            </w:r>
+          </w:p>
+        </w:tc>
+        <w:tc>
+          <w:tcPr>
+            <w:tcW w:type="dxa" w:w="8787"/>
+          </w:tcPr>
+          <w:p>
+            <w:r/>
+            <w:r>
+              <w:rPr>
+                <w:sz w:val="18"/>
+              </w:rPr>
+              <w:t>MRI(조영 전후)는 surveillance MRI가 CT보다 적합한 종양에서 CECT를 대체할 수 있음</w:t>
+            </w:r>
+          </w:p>
+        </w:tc>
+      </w:tr>
+    </w:tbl>
+    <w:p/>
+    <w:p>
+      <w:pPr>
+        <w:pStyle w:val="ListBullet"/>
+      </w:pPr>
+      <w:r>
+        <w:t>Atlas(Emory) 기관 예: 8–12주 PET + CECT neck → 음성이면 6개월 CECT neck + chest → 6개월 CECT neck → 8–12개월 CECT neck + chest</w:t>
+      </w:r>
+    </w:p>
+    <w:p>
+      <w:r>
+        <w:rPr>
+          <w:b w:val="0"/>
+          <w:i/>
+          <w:color w:val="666666"/>
+          <w:sz w:val="17"/>
+        </w:rPr>
+        <w:t>출처: NI-RADS 보고서 템플릿·Legend·2018 Committee 추적 권고 (ACR NI-RADS 웹페이지 자료, 사용자 제공 이미지); Cavazuti B, Hudgins P, Rath T, Branstetter C, Baugnon K, Corey A, Aiken A. NI-RADS: An Atlas of NI-RADS Categories for Head and Neck Cancer (ACR NI-RADS 웹페이지 자료, 사용자 제공 PDF) p.6</w:t>
       </w:r>
     </w:p>
     <w:p>
@@ -1931,7 +2228,7 @@
           <w:color w:val="666666"/>
           <w:sz w:val="17"/>
         </w:rPr>
-        <w:t>출처: Cancer Imaging 2026 리뷰 (doi:10.1186/s40644-026-00989-y) (NI-RADS MRI 2025 권고 요약)</w:t>
+        <w:t>출처: Zander DA, Aiken AH, ... Bunch PM. Cancer Imaging 2026 리뷰 (doi:10.1186/s40644-026-00989-y) (NI-RADS MRI 2025 권고 요약)</w:t>
       </w:r>
     </w:p>
     <w:p>
@@ -1972,6 +2269,596 @@
           <w:sz w:val="17"/>
         </w:rPr>
         <w:t>※ 아래 용어는 제공된 ACR 공식 표·알고리즘에 쓰인 표현을 모은 것입니다. ACR의 별도 lexicon 문서 전문은 확보하지 못했습니다 [미확인].</w:t>
+      </w:r>
+    </w:p>
+    <w:p>
+      <w:pPr>
+        <w:spacing w:before="160"/>
+      </w:pPr>
+      <w:r>
+        <w:rPr>
+          <w:b/>
+          <w:i w:val="0"/>
+          <w:color w:val="1F3A5F"/>
+          <w:sz w:val="23"/>
+        </w:rPr>
+        <w:t>6-0. NI-RADS 원조 Lexicon (Atlas, CECT/PET 기준)</w:t>
+      </w:r>
+    </w:p>
+    <w:tbl>
+      <w:tblPr>
+        <w:tblStyle w:val="TableGrid"/>
+        <w:tblW w:type="auto" w:w="0"/>
+        <w:tblLook w:firstColumn="1" w:firstRow="1" w:lastColumn="0" w:lastRow="0" w:noHBand="0" w:noVBand="1" w:val="04A0"/>
+      </w:tblPr>
+      <w:tblGrid>
+        <w:gridCol w:w="3324"/>
+        <w:gridCol w:w="3324"/>
+        <w:gridCol w:w="3324"/>
+      </w:tblGrid>
+      <w:tr>
+        <w:tc>
+          <w:tcPr>
+            <w:tcW w:type="dxa" w:w="2835"/>
+            <w:shd w:val="clear" w:color="auto" w:fill="1F3A5F"/>
+          </w:tcPr>
+          <w:p>
+            <w:r/>
+            <w:r>
+              <w:rPr>
+                <w:b/>
+                <w:color w:val="FFFFFF"/>
+                <w:sz w:val="18"/>
+              </w:rPr>
+              <w:t>구분</w:t>
+            </w:r>
+          </w:p>
+        </w:tc>
+        <w:tc>
+          <w:tcPr>
+            <w:tcW w:type="dxa" w:w="5102"/>
+            <w:shd w:val="clear" w:color="auto" w:fill="1F3A5F"/>
+          </w:tcPr>
+          <w:p>
+            <w:r/>
+            <w:r>
+              <w:rPr>
+                <w:b/>
+                <w:color w:val="FFFFFF"/>
+                <w:sz w:val="18"/>
+              </w:rPr>
+              <w:t>Lexicon</w:t>
+            </w:r>
+          </w:p>
+        </w:tc>
+        <w:tc>
+          <w:tcPr>
+            <w:tcW w:type="dxa" w:w="1701"/>
+            <w:shd w:val="clear" w:color="auto" w:fill="1F3A5F"/>
+          </w:tcPr>
+          <w:p>
+            <w:r/>
+            <w:r>
+              <w:rPr>
+                <w:b/>
+                <w:color w:val="FFFFFF"/>
+                <w:sz w:val="18"/>
+              </w:rPr>
+              <w:t>→ Category</w:t>
+            </w:r>
+          </w:p>
+        </w:tc>
+      </w:tr>
+      <w:tr>
+        <w:tc>
+          <w:tcPr>
+            <w:tcW w:type="dxa" w:w="2835"/>
+          </w:tcPr>
+          <w:p>
+            <w:r/>
+            <w:r>
+              <w:rPr>
+                <w:b/>
+                <w:sz w:val="18"/>
+              </w:rPr>
+              <w:t>Non-mass-like soft tissue</w:t>
+            </w:r>
+          </w:p>
+        </w:tc>
+        <w:tc>
+          <w:tcPr>
+            <w:tcW w:type="dxa" w:w="5102"/>
+          </w:tcPr>
+          <w:p>
+            <w:r/>
+            <w:r>
+              <w:rPr>
+                <w:sz w:val="18"/>
+              </w:rPr>
+              <w:t>Hypo-enhancing distortion of soft tissue and fat planes</w:t>
+            </w:r>
+          </w:p>
+        </w:tc>
+        <w:tc>
+          <w:tcPr>
+            <w:tcW w:type="dxa" w:w="1701"/>
+          </w:tcPr>
+          <w:p>
+            <w:r/>
+            <w:r>
+              <w:rPr>
+                <w:sz w:val="18"/>
+              </w:rPr>
+              <w:t>1</w:t>
+            </w:r>
+          </w:p>
+        </w:tc>
+      </w:tr>
+      <w:tr>
+        <w:tc>
+          <w:tcPr>
+            <w:tcW w:type="dxa" w:w="2835"/>
+          </w:tcPr>
+          <w:p>
+            <w:r/>
+            <w:r>
+              <w:rPr>
+                <w:b/>
+                <w:sz w:val="18"/>
+              </w:rPr>
+              <w:t>Mass — morphology</w:t>
+            </w:r>
+          </w:p>
+        </w:tc>
+        <w:tc>
+          <w:tcPr>
+            <w:tcW w:type="dxa" w:w="5102"/>
+          </w:tcPr>
+          <w:p>
+            <w:r/>
+            <w:r>
+              <w:rPr>
+                <w:sz w:val="18"/>
+              </w:rPr>
+              <w:t>Ill-defined vs discrete</w:t>
+            </w:r>
+          </w:p>
+        </w:tc>
+        <w:tc>
+          <w:tcPr>
+            <w:tcW w:type="dxa" w:w="1701"/>
+          </w:tcPr>
+          <w:p>
+            <w:r/>
+            <w:r>
+              <w:rPr>
+                <w:sz w:val="18"/>
+              </w:rPr>
+              <w:t>2 vs 3</w:t>
+            </w:r>
+          </w:p>
+        </w:tc>
+      </w:tr>
+      <w:tr>
+        <w:tc>
+          <w:tcPr>
+            <w:tcW w:type="dxa" w:w="2835"/>
+          </w:tcPr>
+          <w:p>
+            <w:r/>
+            <w:r>
+              <w:rPr>
+                <w:b/>
+                <w:sz w:val="18"/>
+              </w:rPr>
+              <w:t>Mass — enhancement</w:t>
+            </w:r>
+          </w:p>
+        </w:tc>
+        <w:tc>
+          <w:tcPr>
+            <w:tcW w:type="dxa" w:w="5102"/>
+          </w:tcPr>
+          <w:p>
+            <w:r/>
+            <w:r>
+              <w:rPr>
+                <w:sz w:val="18"/>
+              </w:rPr>
+              <w:t>Mild vs robust</w:t>
+            </w:r>
+          </w:p>
+        </w:tc>
+        <w:tc>
+          <w:tcPr>
+            <w:tcW w:type="dxa" w:w="1701"/>
+          </w:tcPr>
+          <w:p>
+            <w:r/>
+            <w:r>
+              <w:rPr>
+                <w:sz w:val="18"/>
+              </w:rPr>
+              <w:t>2 vs 3</w:t>
+            </w:r>
+          </w:p>
+        </w:tc>
+      </w:tr>
+      <w:tr>
+        <w:tc>
+          <w:tcPr>
+            <w:tcW w:type="dxa" w:w="2835"/>
+          </w:tcPr>
+          <w:p>
+            <w:r/>
+            <w:r>
+              <w:rPr>
+                <w:b/>
+                <w:sz w:val="18"/>
+              </w:rPr>
+              <w:t>Mass — FDG (배경 대비)</w:t>
+            </w:r>
+          </w:p>
+        </w:tc>
+        <w:tc>
+          <w:tcPr>
+            <w:tcW w:type="dxa" w:w="5102"/>
+          </w:tcPr>
+          <w:p>
+            <w:r/>
+            <w:r>
+              <w:rPr>
+                <w:sz w:val="18"/>
+              </w:rPr>
+              <w:t>Mild vs intense</w:t>
+            </w:r>
+          </w:p>
+        </w:tc>
+        <w:tc>
+          <w:tcPr>
+            <w:tcW w:type="dxa" w:w="1701"/>
+          </w:tcPr>
+          <w:p>
+            <w:r/>
+            <w:r>
+              <w:rPr>
+                <w:sz w:val="18"/>
+              </w:rPr>
+              <w:t>2 vs 3</w:t>
+            </w:r>
+          </w:p>
+        </w:tc>
+      </w:tr>
+      <w:tr>
+        <w:tc>
+          <w:tcPr>
+            <w:tcW w:type="dxa" w:w="2835"/>
+          </w:tcPr>
+          <w:p>
+            <w:r/>
+            <w:r>
+              <w:rPr>
+                <w:b/>
+                <w:sz w:val="18"/>
+              </w:rPr>
+              <w:t>Mucosal abnormality</w:t>
+            </w:r>
+          </w:p>
+        </w:tc>
+        <w:tc>
+          <w:tcPr>
+            <w:tcW w:type="dxa" w:w="5102"/>
+          </w:tcPr>
+          <w:p>
+            <w:r/>
+            <w:r>
+              <w:rPr>
+                <w:sz w:val="18"/>
+              </w:rPr>
+              <w:t>Mucoid density</w:t>
+            </w:r>
+          </w:p>
+        </w:tc>
+        <w:tc>
+          <w:tcPr>
+            <w:tcW w:type="dxa" w:w="1701"/>
+          </w:tcPr>
+          <w:p>
+            <w:r/>
+            <w:r>
+              <w:rPr>
+                <w:sz w:val="18"/>
+              </w:rPr>
+              <w:t>1</w:t>
+            </w:r>
+          </w:p>
+        </w:tc>
+      </w:tr>
+      <w:tr>
+        <w:tc>
+          <w:tcPr>
+            <w:tcW w:type="dxa" w:w="2835"/>
+          </w:tcPr>
+          <w:p>
+            <w:r/>
+            <w:r>
+              <w:rPr>
+                <w:b/>
+                <w:sz w:val="18"/>
+              </w:rPr>
+            </w:r>
+          </w:p>
+        </w:tc>
+        <w:tc>
+          <w:tcPr>
+            <w:tcW w:type="dxa" w:w="5102"/>
+          </w:tcPr>
+          <w:p>
+            <w:r/>
+            <w:r>
+              <w:rPr>
+                <w:sz w:val="18"/>
+              </w:rPr>
+              <w:t>Diffuse linear enhancement (benign radiation mucositis)</w:t>
+            </w:r>
+          </w:p>
+        </w:tc>
+        <w:tc>
+          <w:tcPr>
+            <w:tcW w:type="dxa" w:w="1701"/>
+          </w:tcPr>
+          <w:p>
+            <w:r/>
+            <w:r>
+              <w:rPr>
+                <w:sz w:val="18"/>
+              </w:rPr>
+              <w:t>1</w:t>
+            </w:r>
+          </w:p>
+        </w:tc>
+      </w:tr>
+      <w:tr>
+        <w:tc>
+          <w:tcPr>
+            <w:tcW w:type="dxa" w:w="2835"/>
+          </w:tcPr>
+          <w:p>
+            <w:r/>
+            <w:r>
+              <w:rPr>
+                <w:b/>
+                <w:sz w:val="18"/>
+              </w:rPr>
+            </w:r>
+          </w:p>
+        </w:tc>
+        <w:tc>
+          <w:tcPr>
+            <w:tcW w:type="dxa" w:w="5102"/>
+          </w:tcPr>
+          <w:p>
+            <w:r/>
+            <w:r>
+              <w:rPr>
+                <w:sz w:val="18"/>
+              </w:rPr>
+              <w:t>Focal mucosal enhancement 또는 FDG uptake</w:t>
+            </w:r>
+          </w:p>
+        </w:tc>
+        <w:tc>
+          <w:tcPr>
+            <w:tcW w:type="dxa" w:w="1701"/>
+          </w:tcPr>
+          <w:p>
+            <w:r/>
+            <w:r>
+              <w:rPr>
+                <w:sz w:val="18"/>
+              </w:rPr>
+              <w:t>2a</w:t>
+            </w:r>
+          </w:p>
+        </w:tc>
+      </w:tr>
+      <w:tr>
+        <w:tc>
+          <w:tcPr>
+            <w:tcW w:type="dxa" w:w="2835"/>
+          </w:tcPr>
+          <w:p>
+            <w:r/>
+            <w:r>
+              <w:rPr>
+                <w:b/>
+                <w:sz w:val="18"/>
+              </w:rPr>
+              <w:t>Lymph node — residual nodal tissue</w:t>
+            </w:r>
+          </w:p>
+        </w:tc>
+        <w:tc>
+          <w:tcPr>
+            <w:tcW w:type="dxa" w:w="5102"/>
+          </w:tcPr>
+          <w:p>
+            <w:r/>
+            <w:r>
+              <w:rPr>
+                <w:sz w:val="18"/>
+              </w:rPr>
+              <w:t>FDG 없음 / mild FDG / intense FDG (배경 대비)</w:t>
+            </w:r>
+          </w:p>
+        </w:tc>
+        <w:tc>
+          <w:tcPr>
+            <w:tcW w:type="dxa" w:w="1701"/>
+          </w:tcPr>
+          <w:p>
+            <w:r/>
+            <w:r>
+              <w:rPr>
+                <w:sz w:val="18"/>
+              </w:rPr>
+              <w:t>1 / 2 / 3</w:t>
+            </w:r>
+          </w:p>
+        </w:tc>
+      </w:tr>
+      <w:tr>
+        <w:tc>
+          <w:tcPr>
+            <w:tcW w:type="dxa" w:w="2835"/>
+          </w:tcPr>
+          <w:p>
+            <w:r/>
+            <w:r>
+              <w:rPr>
+                <w:b/>
+                <w:sz w:val="18"/>
+              </w:rPr>
+              <w:t>Lymph node — growing node</w:t>
+            </w:r>
+          </w:p>
+        </w:tc>
+        <w:tc>
+          <w:tcPr>
+            <w:tcW w:type="dxa" w:w="5102"/>
+          </w:tcPr>
+          <w:p>
+            <w:r/>
+            <w:r>
+              <w:rPr>
+                <w:sz w:val="18"/>
+              </w:rPr>
+              <w:t>예상 림프 배액 경로를 따르며 definite abnormal morphology 없음</w:t>
+            </w:r>
+          </w:p>
+        </w:tc>
+        <w:tc>
+          <w:tcPr>
+            <w:tcW w:type="dxa" w:w="1701"/>
+          </w:tcPr>
+          <w:p>
+            <w:r/>
+            <w:r>
+              <w:rPr>
+                <w:sz w:val="18"/>
+              </w:rPr>
+              <w:t>2</w:t>
+            </w:r>
+          </w:p>
+        </w:tc>
+      </w:tr>
+      <w:tr>
+        <w:tc>
+          <w:tcPr>
+            <w:tcW w:type="dxa" w:w="2835"/>
+          </w:tcPr>
+          <w:p>
+            <w:r/>
+            <w:r>
+              <w:rPr>
+                <w:b/>
+                <w:sz w:val="18"/>
+              </w:rPr>
+            </w:r>
+          </w:p>
+        </w:tc>
+        <w:tc>
+          <w:tcPr>
+            <w:tcW w:type="dxa" w:w="5102"/>
+          </w:tcPr>
+          <w:p>
+            <w:r/>
+            <w:r>
+              <w:rPr>
+                <w:sz w:val="18"/>
+              </w:rPr>
+              <w:t>Abnormal morphology 동반</w:t>
+            </w:r>
+          </w:p>
+        </w:tc>
+        <w:tc>
+          <w:tcPr>
+            <w:tcW w:type="dxa" w:w="1701"/>
+          </w:tcPr>
+          <w:p>
+            <w:r/>
+            <w:r>
+              <w:rPr>
+                <w:sz w:val="18"/>
+              </w:rPr>
+              <w:t>3</w:t>
+            </w:r>
+          </w:p>
+        </w:tc>
+      </w:tr>
+      <w:tr>
+        <w:tc>
+          <w:tcPr>
+            <w:tcW w:type="dxa" w:w="2835"/>
+          </w:tcPr>
+          <w:p>
+            <w:r/>
+            <w:r>
+              <w:rPr>
+                <w:b/>
+                <w:sz w:val="18"/>
+              </w:rPr>
+            </w:r>
+          </w:p>
+        </w:tc>
+        <w:tc>
+          <w:tcPr>
+            <w:tcW w:type="dxa" w:w="5102"/>
+          </w:tcPr>
+          <w:p>
+            <w:r/>
+            <w:r>
+              <w:rPr>
+                <w:sz w:val="18"/>
+              </w:rPr>
+              <w:t>Intense FDG 동반</w:t>
+            </w:r>
+          </w:p>
+        </w:tc>
+        <w:tc>
+          <w:tcPr>
+            <w:tcW w:type="dxa" w:w="1701"/>
+          </w:tcPr>
+          <w:p>
+            <w:r/>
+            <w:r>
+              <w:rPr>
+                <w:sz w:val="18"/>
+              </w:rPr>
+              <w:t>3 또는 4</w:t>
+            </w:r>
+          </w:p>
+        </w:tc>
+      </w:tr>
+    </w:tbl>
+    <w:p/>
+    <w:p>
+      <w:pPr>
+        <w:pStyle w:val="ListBullet"/>
+      </w:pPr>
+      <w:r>
+        <w:t>핵심 축: 형태(ill-defined → discrete) · 조영(mild → robust) · FDG(mild → intense). 오른쪽으로 갈수록 3</w:t>
+      </w:r>
+    </w:p>
+    <w:p>
+      <w:r>
+        <w:rPr>
+          <w:b w:val="0"/>
+          <w:i/>
+          <w:color w:val="666666"/>
+          <w:sz w:val="17"/>
+        </w:rPr>
+        <w:t>출처: Cavazuti B, Hudgins P, Rath T, Branstetter C, Baugnon K, Corey A, Aiken A. NI-RADS: An Atlas of NI-RADS Categories for Head and Neck Cancer (ACR NI-RADS 웹페이지 자료, 사용자 제공 PDF) p.11–12</w:t>
       </w:r>
     </w:p>
     <w:p>
@@ -4381,6 +5268,14 @@
         <w:pStyle w:val="ListBullet"/>
       </w:pPr>
       <w:r>
+        <w:t>Atlas(Emory 초기 데이터): NI-RADS 1 약 4% 양성, NI-RADS 2a 17%만 양성(대부분 위양성), NI-RADS 3 약 59% 양성</w:t>
+      </w:r>
+    </w:p>
+    <w:p>
+      <w:pPr>
+        <w:pStyle w:val="ListBullet"/>
+      </w:pPr>
+      <w:r>
         <w:t>2a와 2b의 재발률을 따로 보고한 연구는 적음 (Dinkelborg: 2a 7.1%, 2b 5.6%) — 메타분석은 2를 합쳐 제시</w:t>
       </w:r>
     </w:p>
@@ -4408,7 +5303,7 @@
           <w:color w:val="666666"/>
           <w:sz w:val="17"/>
         </w:rPr>
-        <w:t>출처: Baba A, et al. AJNR 2023 메타분석 (doi:10.3174/ajnr.A7992); Krieger 2017 AJNR (doi:10.3174/ajnr.A5157); Hsu 2019 OHNS (doi:10.1177/0194599819865235); Johansson 2022 Laryngoscope (doi:10.1002/lary.30025); Dagher 2025 AJNR (doi:10.3174/ajnr.A8717); Dinkelborg 수치는 Vertulli et al. Bioengineering 2025 (doi:10.3390/bioengineering12040398) 재인용; Cancer Imaging 2026 리뷰 (doi:10.1186/s40644-026-00989-y)</w:t>
+        <w:t>출처: Baba A, et al. AJNR 2023 메타분석 (doi:10.3174/ajnr.A7992); Krieger 2017 AJNR (doi:10.3174/ajnr.A5157); Hsu 2019 OHNS (doi:10.1177/0194599819865235); Johansson 2022 Laryngoscope (doi:10.1002/lary.30025); Dagher 2025 AJNR (doi:10.3174/ajnr.A8717); Dinkelborg 수치는 Vertulli D, Parillo M, Mallio CA. Bioengineering 2025 (doi:10.3390/bioengineering12040398) 재인용; Zander DA, Aiken AH, ... Bunch PM. Cancer Imaging 2026 리뷰 (doi:10.1186/s40644-026-00989-y); Cavazuti B, Hudgins P, Rath T, Branstetter C, Baugnon K, Corey A, Aiken A. NI-RADS: An Atlas of NI-RADS Categories for Head and Neck Cancer (ACR NI-RADS 웹페이지 자료, 사용자 제공 PDF) p.14, 17, 20</w:t>
       </w:r>
     </w:p>
     <w:p>
@@ -7188,7 +8083,7 @@
                 <w:b/>
                 <w:sz w:val="18"/>
               </w:rPr>
-              <w:t>Deep discrete mass</w:t>
+              <w:t>Deep discrete mass, new 또는 enlarging</w:t>
             </w:r>
           </w:p>
         </w:tc>
@@ -7202,7 +8097,7 @@
               <w:rPr>
                 <w:sz w:val="18"/>
               </w:rPr>
-              <w:t>알고리즘상 2b → 3개월 f/u 또는 PET</w:t>
+              <w:t>Primary 3 → biopsy</w:t>
             </w:r>
           </w:p>
         </w:tc>
@@ -7216,7 +8111,52 @@
               <w:rPr>
                 <w:sz w:val="18"/>
               </w:rPr>
-              <w:t>아래 주의 참고</w:t>
+              <w:t>Legend (without PET)</w:t>
+            </w:r>
+          </w:p>
+        </w:tc>
+      </w:tr>
+      <w:tr>
+        <w:tc>
+          <w:tcPr>
+            <w:tcW w:type="dxa" w:w="4252"/>
+          </w:tcPr>
+          <w:p>
+            <w:r/>
+            <w:r>
+              <w:rPr>
+                <w:b/>
+                <w:sz w:val="18"/>
+              </w:rPr>
+              <w:t>Deep discrete mass, 안정적이거나 애매함</w:t>
+            </w:r>
+          </w:p>
+        </w:tc>
+        <w:tc>
+          <w:tcPr>
+            <w:tcW w:type="dxa" w:w="2835"/>
+          </w:tcPr>
+          <w:p>
+            <w:r/>
+            <w:r>
+              <w:rPr>
+                <w:sz w:val="18"/>
+              </w:rPr>
+              <w:t>Primary 2b → 3개월 f/u 또는 PET</w:t>
+            </w:r>
+          </w:p>
+        </w:tc>
+        <w:tc>
+          <w:tcPr>
+            <w:tcW w:type="dxa" w:w="2551"/>
+          </w:tcPr>
+          <w:p>
+            <w:r/>
+            <w:r>
+              <w:rPr>
+                <w:sz w:val="18"/>
+              </w:rPr>
+              <w:t>알고리즘 no PET → 2b [해설]</w:t>
             </w:r>
           </w:p>
         </w:tc>
@@ -7414,7 +8354,7 @@
         <w:tc>
           <w:tcPr>
             <w:tcW w:type="dxa" w:w="9972"/>
-            <w:shd w:val="clear" w:color="auto" w:fill="FFF2CC"/>
+            <w:shd w:val="clear" w:color="auto" w:fill="E2F0D9"/>
           </w:tcPr>
           <w:p>
             <w:r/>
@@ -7424,7 +8364,7 @@
                 <w:color w:val="1F3A5F"/>
                 <w:sz w:val="20"/>
               </w:rPr>
-              <w:t>주의 — Deep discrete mass에서 문서 간 표현 차이 [미확인]</w:t>
+              <w:t>Deep discrete mass — PET 없을 때 (템플릿 legend로 정리)</w:t>
             </w:r>
           </w:p>
           <w:p>
@@ -7448,15 +8388,31 @@
               <w:rPr>
                 <w:sz w:val="18"/>
               </w:rPr>
-              <w:t>• 두 문서 표현이 완전히 일치하지 않음. 실제 연구에서는 surveillance CT만으로 원발 NI-RADS 3을 준 예가 흔함 (Johansson 2022: CT NI-RADS 3 병변 51개 중 32개가 원발)</w:t>
-            </w:r>
-          </w:p>
-          <w:p>
-            <w:r>
-              <w:rPr>
-                <w:sz w:val="18"/>
-              </w:rPr>
-              <w:t>• → 기관별로 적용 기준을 미리 합의해 두기를 권장</w:t>
+              <w:t>• 보고서 템플릿의 'Legend for CECT or MRI without PET': Primary 3 = 'High suspicion (new or enlarging discrete nodule/mass): biopsy' → PET 없이도 3</w:t>
+            </w:r>
+          </w:p>
+          <w:p>
+            <w:r>
+              <w:rPr>
+                <w:sz w:val="18"/>
+              </w:rPr>
+              <w:t>• Atlas CECT legend도 동일: '3: High suspicion (new or enlarging discrete nodule/mass): biopsy'</w:t>
+            </w:r>
+          </w:p>
+          <w:p>
+            <w:r>
+              <w:rPr>
+                <w:sz w:val="18"/>
+              </w:rPr>
+              <w:t>• [해설] 정리: new 또는 enlarging discrete mass → CECT만으로 3 / 커지지 않는(안정적) discrete mass 또는 판단이 애매한 경우 → 2b + PET 권고 (알고리즘의 'no PET → 2b')</w:t>
+            </w:r>
+          </w:p>
+          <w:p>
+            <w:r>
+              <w:rPr>
+                <w:sz w:val="18"/>
+              </w:rPr>
+              <w:t>• 실제로 surveillance CT만으로 원발 NI-RADS 3을 준 예가 흔함 (Johansson 2022: CT NI-RADS 3 병변 51개 중 32개가 원발)</w:t>
             </w:r>
           </w:p>
         </w:tc>
@@ -7509,7 +8465,7 @@
           <w:color w:val="666666"/>
           <w:sz w:val="17"/>
         </w:rPr>
-        <w:t>출처: ACR NI-RADS™ PET/CT Category Descriptors, Imaging Findings, and Management (Jan 2021); ACR NI-RADS Primary Site / Neck Nodes Category and Management 알고리즘 (PET/CT); Johansson 2022 (doi:10.1002/lary.30025); Dagher 2025 (doi:10.3174/ajnr.A8717); Vertulli et al. Bioengineering 2025 (doi:10.3390/bioengineering12040398)</w:t>
+        <w:t>출처: ACR NI-RADS™ PET/CT Category Descriptors, Imaging Findings, and Management (Jan 2021); ACR NI-RADS Primary Site / Neck Nodes Category and Management 알고리즘 (PET/CT); NI-RADS 보고서 템플릿·Legend·2018 Committee 추적 권고 (ACR NI-RADS 웹페이지 자료, 사용자 제공 이미지); Cavazuti B, Hudgins P, Rath T, Branstetter C, Baugnon K, Corey A, Aiken A. NI-RADS: An Atlas of NI-RADS Categories for Head and Neck Cancer (ACR NI-RADS 웹페이지 자료, 사용자 제공 PDF) p.10; Johansson 2022 (doi:10.1002/lary.30025); Dagher 2025 (doi:10.3174/ajnr.A8717); Vertulli D, Parillo M, Mallio CA. Bioengineering 2025 (doi:10.3390/bioengineering12040398)</w:t>
       </w:r>
     </w:p>
     <w:p>
@@ -10113,7 +11069,7 @@
           <w:color w:val="666666"/>
           <w:sz w:val="17"/>
         </w:rPr>
-        <w:t>출처: ACR NI-RADS™ MRI v2025 Assessment Categories (Aug 2025); ACR NI-RADS™ MRI v2025 Primary Site Algorithm (Nov 2025); Cancer Imaging 2026 리뷰 (doi:10.1186/s40644-026-00989-y)</w:t>
+        <w:t>출처: ACR NI-RADS™ MRI v2025 Assessment Categories (Aug 2025); ACR NI-RADS™ MRI v2025 Primary Site Algorithm (Nov 2025); Zander DA, Aiken AH, ... Bunch PM. Cancer Imaging 2026 리뷰 (doi:10.1186/s40644-026-00989-y)</w:t>
       </w:r>
     </w:p>
     <w:p>
@@ -10891,7 +11847,7 @@
         <w:tc>
           <w:tcPr>
             <w:tcW w:type="dxa" w:w="9972"/>
-            <w:shd w:val="clear" w:color="auto" w:fill="FFF2CC"/>
+            <w:shd w:val="clear" w:color="auto" w:fill="E2F0D9"/>
           </w:tcPr>
           <w:p>
             <w:r/>
@@ -10901,7 +11857,7 @@
                 <w:color w:val="1F3A5F"/>
                 <w:sz w:val="20"/>
               </w:rPr>
-              <w:t>주의 — Deep discrete mass (MRI 단독) [미확인]</w:t>
+              <w:t>Deep discrete mass (MRI 단독) — 템플릿 legend로 정리</w:t>
             </w:r>
           </w:p>
           <w:p>
@@ -10933,7 +11889,15 @@
               <w:rPr>
                 <w:sz w:val="18"/>
               </w:rPr>
-              <w:t>• [해설] 원래 종양과 일치 + new/enlarging이면 표 기준 3이 자연스러우나, 기관별로 적용 기준을 합의해 두기를 권장</w:t>
+              <w:t>• 보고서 템플릿 'Legend for CECT or MRI without PET': Primary 3 = new or enlarging discrete nodule/mass → biopsy (MRI에도 PET 없이 적용)</w:t>
+            </w:r>
+          </w:p>
+          <w:p>
+            <w:r>
+              <w:rPr>
+                <w:sz w:val="18"/>
+              </w:rPr>
+              <w:t>• [해설] 정리: 원래 종양과 신호 일치 + new/enlarging → 3 / 원래 종양과 다르고 안정적 → 2b / 달라도 지속 성장 → 3 (§)</w:t>
             </w:r>
           </w:p>
         </w:tc>
@@ -10964,7 +11928,7 @@
           <w:color w:val="666666"/>
           <w:sz w:val="17"/>
         </w:rPr>
-        <w:t>출처: ACR NI-RADS™ MRI v2025 Assessment Categories (Aug 2025); ACR NI-RADS™ MRI v2025 Primary Site Algorithm (Nov 2025); ACR NI-RADS™ MRI v2025 Neck Nodes Algorithm (Nov 2025); Cancer Imaging 2026 리뷰 (doi:10.1186/s40644-026-00989-y); Ashour 2021 AJNR (doi:10.3174/ajnr.A7058)</w:t>
+        <w:t>출처: ACR NI-RADS™ MRI v2025 Assessment Categories (Aug 2025); ACR NI-RADS™ MRI v2025 Primary Site Algorithm (Nov 2025); ACR NI-RADS™ MRI v2025 Neck Nodes Algorithm (Nov 2025); Zander DA, Aiken AH, ... Bunch PM. Cancer Imaging 2026 리뷰 (doi:10.1186/s40644-026-00989-y); Ashour 2021 AJNR (doi:10.3174/ajnr.A7058)</w:t>
       </w:r>
     </w:p>
     <w:p>
@@ -12638,134 +13602,66 @@
           <w:color w:val="1F3A5F"/>
           <w:sz w:val="28"/>
         </w:rPr>
-        <w:t>21. 보고서 작성 예시 [해설: ACR 공식 template 문구 아님, 구조 참고용]</w:t>
+        <w:t>21. 보고서 작성 — 템플릿 구조</w:t>
+      </w:r>
+    </w:p>
+    <w:p>
+      <w:pPr>
+        <w:pStyle w:val="ListBullet"/>
+      </w:pPr>
+      <w:r>
+        <w:t>실제 NI-RADS 템플릿 원문과 legend는 25장에 정리. 여기서는 작성 요령만</w:t>
+      </w:r>
+    </w:p>
+    <w:p>
+      <w:pPr>
+        <w:pStyle w:val="ListBullet"/>
+      </w:pPr>
+      <w:r>
+        <w:t>Findings는 간결하게, Impression에서 Primary와 Neck을 따로 점수화 (관리가 따로이므로)</w:t>
+      </w:r>
+    </w:p>
+    <w:p>
+      <w:pPr>
+        <w:pStyle w:val="ListBullet"/>
+      </w:pPr>
+      <w:r>
+        <w:t>CT는 'CT-NI-RADS Score', MRI는 'MR-NI-RADS Score'로 모달리티를 명시</w:t>
+      </w:r>
+    </w:p>
+    <w:p>
+      <w:pPr>
+        <w:pStyle w:val="ListBullet"/>
+      </w:pPr>
+      <w:r>
+        <w:t>MRI가 upper neck만 포함하면 'Incomplete evaluation of regional nodes'라고 쓰고 해석 범위를 밝힘 (v2025 기준으로는 경부 평가 불가 시 N-x)</w:t>
+      </w:r>
+    </w:p>
+    <w:p>
+      <w:pPr>
+        <w:pStyle w:val="ListBullet"/>
+      </w:pPr>
+      <w:r>
+        <w:t>보고서 하단에 legend를 붙여 어떤 임상의가 읽어도 category별 다음 단계를 알 수 있게 함</w:t>
+      </w:r>
+    </w:p>
+    <w:p>
+      <w:pPr>
+        <w:pStyle w:val="ListBullet"/>
+      </w:pPr>
+      <w:r>
+        <w:t>흉부·복부가 포함된 경우 Distant disease를 같은 1–4로 선택적으로 기재</w:t>
       </w:r>
     </w:p>
     <w:p>
       <w:r>
         <w:rPr>
           <w:b w:val="0"/>
-          <w:i w:val="0"/>
-          <w:sz w:val="18"/>
+          <w:i/>
+          <w:color w:val="666666"/>
+          <w:sz w:val="17"/>
         </w:rPr>
-        <w:t>EXAM: Neck MRI with and without contrast (또는 Neck CECT / PET/CECT) — post-treatment surveillance</w:t>
-      </w:r>
-    </w:p>
-    <w:p>
-      <w:r>
-        <w:rPr>
-          <w:b w:val="0"/>
-          <w:i w:val="0"/>
-          <w:sz w:val="18"/>
-        </w:rPr>
-        <w:t>COMPARISON: Pre-treatment 검사 (날짜), prior post-treatment 검사 (날짜)</w:t>
-      </w:r>
-    </w:p>
-    <w:p>
-      <w:r>
-        <w:rPr>
-          <w:b w:val="0"/>
-          <w:i w:val="0"/>
-          <w:sz w:val="18"/>
-        </w:rPr>
-        <w:t>CLINICAL: 원발 부위, 병리, 치료 방법, 치료 종료일</w:t>
-      </w:r>
-    </w:p>
-    <w:p>
-      <w:r>
-        <w:rPr>
-          <w:b w:val="0"/>
-          <w:i w:val="0"/>
-          <w:sz w:val="18"/>
-        </w:rPr>
-      </w:r>
-    </w:p>
-    <w:p>
-      <w:r>
-        <w:rPr>
-          <w:b w:val="0"/>
-          <w:i w:val="0"/>
-          <w:sz w:val="18"/>
-        </w:rPr>
-        <w:t>PRIMARY SITE: 소견 (위치 / 조영 양상 / T2·DWI(MRI) / FDG(PET) / perineural / 비교).</w:t>
-      </w:r>
-    </w:p>
-    <w:p>
-      <w:r>
-        <w:rPr>
-          <w:b w:val="0"/>
-          <w:i w:val="0"/>
-          <w:sz w:val="18"/>
-        </w:rPr>
-        <w:t xml:space="preserve">  → NI-RADS [MRI 또는 CT/PET] Primary [ 1 / 2a / 2b / 3 / 4 / 0 / P-x / P-unknown primary ]</w:t>
-      </w:r>
-    </w:p>
-    <w:p>
-      <w:r>
-        <w:rPr>
-          <w:b w:val="0"/>
-          <w:i w:val="0"/>
-          <w:sz w:val="18"/>
-        </w:rPr>
-        <w:t xml:space="preserve">  → Recommendation: [ Routine surveillance / Direct visual inspection / Short-interval f/u (MRI) or PET / Biopsy ]</w:t>
-      </w:r>
-    </w:p>
-    <w:p>
-      <w:r>
-        <w:rPr>
-          <w:b w:val="0"/>
-          <w:i w:val="0"/>
-          <w:sz w:val="18"/>
-        </w:rPr>
-      </w:r>
-    </w:p>
-    <w:p>
-      <w:r>
-        <w:rPr>
-          <w:b w:val="0"/>
-          <w:i w:val="0"/>
-          <w:sz w:val="18"/>
-        </w:rPr>
-        <w:t>NECK: 소견 (residual vs new/enlarging, 형태, FDG, 비교).</w:t>
-      </w:r>
-    </w:p>
-    <w:p>
-      <w:r>
-        <w:rPr>
-          <w:b w:val="0"/>
-          <w:i w:val="0"/>
-          <w:sz w:val="18"/>
-        </w:rPr>
-        <w:t xml:space="preserve">  → NI-RADS Neck [ 1 / 2 / 3 / 4 / 0 / N-x ]</w:t>
-      </w:r>
-    </w:p>
-    <w:p>
-      <w:r>
-        <w:rPr>
-          <w:b w:val="0"/>
-          <w:i w:val="0"/>
-          <w:sz w:val="18"/>
-        </w:rPr>
-        <w:t xml:space="preserve">  → Recommendation: [ ... ]</w:t>
-      </w:r>
-    </w:p>
-    <w:p>
-      <w:r>
-        <w:rPr>
-          <w:b w:val="0"/>
-          <w:i w:val="0"/>
-          <w:sz w:val="18"/>
-        </w:rPr>
-      </w:r>
-    </w:p>
-    <w:p>
-      <w:r>
-        <w:rPr>
-          <w:b w:val="0"/>
-          <w:i w:val="0"/>
-          <w:sz w:val="18"/>
-        </w:rPr>
-        <w:t>OTHER FINDINGS: 시야 내 기타 소견</w:t>
+        <w:t>출처: NI-RADS 보고서 템플릿·Legend·2018 Committee 추적 권고 (ACR NI-RADS 웹페이지 자료, 사용자 제공 이미지); Cavazuti B, Hudgins P, Rath T, Branstetter C, Baugnon K, Corey A, Aiken A. NI-RADS: An Atlas of NI-RADS Categories for Head and Neck Cancer (ACR NI-RADS 웹페이지 자료, 사용자 제공 PDF) p.9–10; ACR NI-RADS™ MRI v2025 Assessment Categories (Aug 2025)</w:t>
       </w:r>
     </w:p>
     <w:p>
@@ -14074,7 +14970,7 @@
           <w:color w:val="1F3A5F"/>
           <w:sz w:val="28"/>
         </w:rPr>
-        <w:t>23. 자가점검 퀴즈 (O/X 20문항)</w:t>
+        <w:t>23. 자가점검 퀴즈 (O/X 24문항)</w:t>
       </w:r>
     </w:p>
     <w:tbl>
@@ -15335,6 +16231,242 @@
                 <w:sz w:val="18"/>
               </w:rPr>
               <w:t>4장</w:t>
+            </w:r>
+          </w:p>
+        </w:tc>
+      </w:tr>
+      <w:tr>
+        <w:tc>
+          <w:tcPr>
+            <w:tcW w:type="dxa" w:w="454"/>
+          </w:tcPr>
+          <w:p>
+            <w:r/>
+            <w:r>
+              <w:rPr>
+                <w:b/>
+                <w:sz w:val="18"/>
+              </w:rPr>
+              <w:t>21</w:t>
+            </w:r>
+          </w:p>
+        </w:tc>
+        <w:tc>
+          <w:tcPr>
+            <w:tcW w:type="dxa" w:w="6236"/>
+          </w:tcPr>
+          <w:p>
+            <w:r/>
+            <w:r>
+              <w:rPr>
+                <w:sz w:val="18"/>
+              </w:rPr>
+              <w:t>PET 없는 CECT/MRI에서 new 또는 enlarging discrete mass는 Primary 3이다.</w:t>
+            </w:r>
+          </w:p>
+        </w:tc>
+        <w:tc>
+          <w:tcPr>
+            <w:tcW w:type="dxa" w:w="794"/>
+          </w:tcPr>
+          <w:p>
+            <w:r/>
+            <w:r>
+              <w:rPr>
+                <w:sz w:val="18"/>
+              </w:rPr>
+              <w:t>O</w:t>
+            </w:r>
+          </w:p>
+        </w:tc>
+        <w:tc>
+          <w:tcPr>
+            <w:tcW w:type="dxa" w:w="2154"/>
+          </w:tcPr>
+          <w:p>
+            <w:r/>
+            <w:r>
+              <w:rPr>
+                <w:sz w:val="18"/>
+              </w:rPr>
+              <w:t>Legend without PET</w:t>
+            </w:r>
+          </w:p>
+        </w:tc>
+      </w:tr>
+      <w:tr>
+        <w:tc>
+          <w:tcPr>
+            <w:tcW w:type="dxa" w:w="454"/>
+          </w:tcPr>
+          <w:p>
+            <w:r/>
+            <w:r>
+              <w:rPr>
+                <w:b/>
+                <w:sz w:val="18"/>
+              </w:rPr>
+              <w:t>22</w:t>
+            </w:r>
+          </w:p>
+        </w:tc>
+        <w:tc>
+          <w:tcPr>
+            <w:tcW w:type="dxa" w:w="6236"/>
+          </w:tcPr>
+          <w:p>
+            <w:r/>
+            <w:r>
+              <w:rPr>
+                <w:sz w:val="18"/>
+              </w:rPr>
+              <w:t>2018 Committee 권고: 6개월 PET + CECT가 모두 음성이면 추가 surveillance 영상이 필요 없다.</w:t>
+            </w:r>
+          </w:p>
+        </w:tc>
+        <w:tc>
+          <w:tcPr>
+            <w:tcW w:type="dxa" w:w="794"/>
+          </w:tcPr>
+          <w:p>
+            <w:r/>
+            <w:r>
+              <w:rPr>
+                <w:sz w:val="18"/>
+              </w:rPr>
+              <w:t>O</w:t>
+            </w:r>
+          </w:p>
+        </w:tc>
+        <w:tc>
+          <w:tcPr>
+            <w:tcW w:type="dxa" w:w="2154"/>
+          </w:tcPr>
+          <w:p>
+            <w:r/>
+            <w:r>
+              <w:rPr>
+                <w:sz w:val="18"/>
+              </w:rPr>
+              <w:t>5-1-1</w:t>
+            </w:r>
+          </w:p>
+        </w:tc>
+      </w:tr>
+      <w:tr>
+        <w:tc>
+          <w:tcPr>
+            <w:tcW w:type="dxa" w:w="454"/>
+          </w:tcPr>
+          <w:p>
+            <w:r/>
+            <w:r>
+              <w:rPr>
+                <w:b/>
+                <w:sz w:val="18"/>
+              </w:rPr>
+              <w:t>23</w:t>
+            </w:r>
+          </w:p>
+        </w:tc>
+        <w:tc>
+          <w:tcPr>
+            <w:tcW w:type="dxa" w:w="6236"/>
+          </w:tcPr>
+          <w:p>
+            <w:r/>
+            <w:r>
+              <w:rPr>
+                <w:sz w:val="18"/>
+              </w:rPr>
+              <w:t>Atlas에 따르면 NI-RADS 2a의 대부분은 실제 재발이다.</w:t>
+            </w:r>
+          </w:p>
+        </w:tc>
+        <w:tc>
+          <w:tcPr>
+            <w:tcW w:type="dxa" w:w="794"/>
+          </w:tcPr>
+          <w:p>
+            <w:r/>
+            <w:r>
+              <w:rPr>
+                <w:sz w:val="18"/>
+              </w:rPr>
+              <w:t>X</w:t>
+            </w:r>
+          </w:p>
+        </w:tc>
+        <w:tc>
+          <w:tcPr>
+            <w:tcW w:type="dxa" w:w="2154"/>
+          </w:tcPr>
+          <w:p>
+            <w:r/>
+            <w:r>
+              <w:rPr>
+                <w:sz w:val="18"/>
+              </w:rPr>
+              <w:t>17%만 양성</w:t>
+            </w:r>
+          </w:p>
+        </w:tc>
+      </w:tr>
+      <w:tr>
+        <w:tc>
+          <w:tcPr>
+            <w:tcW w:type="dxa" w:w="454"/>
+          </w:tcPr>
+          <w:p>
+            <w:r/>
+            <w:r>
+              <w:rPr>
+                <w:b/>
+                <w:sz w:val="18"/>
+              </w:rPr>
+              <w:t>24</w:t>
+            </w:r>
+          </w:p>
+        </w:tc>
+        <w:tc>
+          <w:tcPr>
+            <w:tcW w:type="dxa" w:w="6236"/>
+          </w:tcPr>
+          <w:p>
+            <w:r/>
+            <w:r>
+              <w:rPr>
+                <w:sz w:val="18"/>
+              </w:rPr>
+              <w:t>NI-RADS 2 vs 3 구분 요령: '조직검사할 뚜렷한 target이 있는가?' 없으면 2.</w:t>
+            </w:r>
+          </w:p>
+        </w:tc>
+        <w:tc>
+          <w:tcPr>
+            <w:tcW w:type="dxa" w:w="794"/>
+          </w:tcPr>
+          <w:p>
+            <w:r/>
+            <w:r>
+              <w:rPr>
+                <w:sz w:val="18"/>
+              </w:rPr>
+              <w:t>O</w:t>
+            </w:r>
+          </w:p>
+        </w:tc>
+        <w:tc>
+          <w:tcPr>
+            <w:tcW w:type="dxa" w:w="2154"/>
+          </w:tcPr>
+          <w:p>
+            <w:r/>
+            <w:r>
+              <w:rPr>
+                <w:sz w:val="18"/>
+              </w:rPr>
+              <w:t>Atlas p.21</w:t>
             </w:r>
           </w:p>
         </w:tc>
@@ -15466,7 +16598,7 @@
         <w:pStyle w:val="ListBullet"/>
       </w:pPr>
       <w:r>
-        <w:t>Neck은 new necrosis·gross ENE가 있으면 CECT만으로 3 / deep discrete mass는 표와 알고리즘 표현 차이 주의 (12장)</w:t>
+        <w:t>Neck은 new necrosis·gross ENE가 있으면 CECT만으로 3 / new 또는 enlarging discrete mass도 PET 없이 3 (legend without PET, 12장)</w:t>
       </w:r>
     </w:p>
     <w:p>
@@ -15510,7 +16642,37 @@
           <w:color w:val="1F3A5F"/>
           <w:sz w:val="23"/>
         </w:rPr>
-        <w:t>Q5. NI-RADS 각 숫자는 악성도가 어느 정도인가요?</w:t>
+        <w:t>Q5. 보고서에는 어떻게 적나요?</w:t>
+      </w:r>
+    </w:p>
+    <w:p>
+      <w:pPr>
+        <w:pStyle w:val="ListBullet"/>
+      </w:pPr>
+      <w:r>
+        <w:t>Impression에 Primary와 Neck을 따로: 'Primary: CT-NI-RADS Score [1]', 'Neck: MR-NI-RADS Score [1]'처럼 모달리티 명시</w:t>
+      </w:r>
+    </w:p>
+    <w:p>
+      <w:pPr>
+        <w:pStyle w:val="ListBullet"/>
+      </w:pPr>
+      <w:r>
+        <w:t>보고서 하단에 PET 유무에 맞는 legend 첨부 (25장)</w:t>
+      </w:r>
+    </w:p>
+    <w:p>
+      <w:pPr>
+        <w:spacing w:before="160"/>
+      </w:pPr>
+      <w:r>
+        <w:rPr>
+          <w:b/>
+          <w:i w:val="0"/>
+          <w:color w:val="1F3A5F"/>
+          <w:sz w:val="23"/>
+        </w:rPr>
+        <w:t>Q6. NI-RADS 각 숫자는 악성도가 어느 정도인가요?</w:t>
       </w:r>
     </w:p>
     <w:p>
@@ -15541,6 +16703,2686 @@
           <w:color w:val="FFFFFF"/>
           <w:sz w:val="32"/>
         </w:rPr>
+        <w:t>PART E-2. Atlas와 템플릿</w:t>
+      </w:r>
+    </w:p>
+    <w:p>
+      <w:pPr>
+        <w:spacing w:before="280"/>
+      </w:pPr>
+      <w:r>
+        <w:rPr>
+          <w:b/>
+          <w:i w:val="0"/>
+          <w:color w:val="1F3A5F"/>
+          <w:sz w:val="28"/>
+        </w:rPr>
+        <w:t>25. 보고서 템플릿과 Legend (PET 유무별)</w:t>
+      </w:r>
+    </w:p>
+    <w:p>
+      <w:pPr>
+        <w:spacing w:before="160"/>
+      </w:pPr>
+      <w:r>
+        <w:rPr>
+          <w:b/>
+          <w:i w:val="0"/>
+          <w:color w:val="1F3A5F"/>
+          <w:sz w:val="23"/>
+        </w:rPr>
+        <w:t>25-1. Post-treatment Neck CECT ± PET 템플릿</w:t>
+      </w:r>
+    </w:p>
+    <w:p>
+      <w:r>
+        <w:rPr>
+          <w:b w:val="0"/>
+          <w:i w:val="0"/>
+          <w:sz w:val="17"/>
+        </w:rPr>
+        <w:t>Post-treatment Neck CECT +/- PET</w:t>
+      </w:r>
+    </w:p>
+    <w:p>
+      <w:r>
+        <w:rPr>
+          <w:b w:val="0"/>
+          <w:i w:val="0"/>
+          <w:sz w:val="17"/>
+        </w:rPr>
+        <w:t>INDICATION: [ ]   Subsite: [ ]   HPV or EBV status: [ ]   Surgery: [ ]   Chemoradiation: [ ]</w:t>
+      </w:r>
+    </w:p>
+    <w:p>
+      <w:r>
+        <w:rPr>
+          <w:b w:val="0"/>
+          <w:i w:val="0"/>
+          <w:sz w:val="17"/>
+        </w:rPr>
+        <w:t>TECHNIQUE:</w:t>
+      </w:r>
+    </w:p>
+    <w:p>
+      <w:r>
+        <w:rPr>
+          <w:b w:val="0"/>
+          <w:i w:val="0"/>
+          <w:sz w:val="17"/>
+        </w:rPr>
+        <w:t>COMPARISON: [&lt;None.&gt;]</w:t>
+      </w:r>
+    </w:p>
+    <w:p>
+      <w:r>
+        <w:rPr>
+          <w:b w:val="0"/>
+          <w:i w:val="0"/>
+          <w:sz w:val="17"/>
+        </w:rPr>
+        <w:t>FINDINGS:</w:t>
+      </w:r>
+    </w:p>
+    <w:p>
+      <w:r>
+        <w:rPr>
+          <w:b w:val="0"/>
+          <w:i w:val="0"/>
+          <w:sz w:val="17"/>
+        </w:rPr>
+        <w:t xml:space="preserve">  Primary site: [&lt;No evidence of recurrent disease.&gt;]</w:t>
+      </w:r>
+    </w:p>
+    <w:p>
+      <w:r>
+        <w:rPr>
+          <w:b w:val="0"/>
+          <w:i w:val="0"/>
+          <w:sz w:val="17"/>
+        </w:rPr>
+        <w:t xml:space="preserve">  Neck: [&lt;No pathologically enlarged, necrotic, or otherwise abnormal lymph nodes.&gt;]</w:t>
+      </w:r>
+    </w:p>
+    <w:p>
+      <w:r>
+        <w:rPr>
+          <w:b w:val="0"/>
+          <w:i w:val="0"/>
+          <w:sz w:val="17"/>
+        </w:rPr>
+        <w:t xml:space="preserve">  Post-treatment changes: Expected post-treatment changes are noted including [&lt;supraglottic mucosal edema and thickening of the skin and subcutaneous soft tissues.&gt;]</w:t>
+      </w:r>
+    </w:p>
+    <w:p>
+      <w:r>
+        <w:rPr>
+          <w:b w:val="0"/>
+          <w:i w:val="0"/>
+          <w:sz w:val="17"/>
+        </w:rPr>
+        <w:t xml:space="preserve">  Aerodigestive tract: [&lt;No findings to suggest a second primary.&gt;]</w:t>
+      </w:r>
+    </w:p>
+    <w:p>
+      <w:r>
+        <w:rPr>
+          <w:b w:val="0"/>
+          <w:i w:val="0"/>
+          <w:sz w:val="17"/>
+        </w:rPr>
+        <w:t xml:space="preserve">  Brain, orbits, spine, and lungs: [&lt;No aggressive lesions suspicious for metastatic involvement&gt;]</w:t>
+      </w:r>
+    </w:p>
+    <w:p>
+      <w:r>
+        <w:rPr>
+          <w:b w:val="0"/>
+          <w:i w:val="0"/>
+          <w:sz w:val="17"/>
+        </w:rPr>
+        <w:t>IMPRESSION:</w:t>
+      </w:r>
+    </w:p>
+    <w:p>
+      <w:r>
+        <w:rPr>
+          <w:b w:val="0"/>
+          <w:i w:val="0"/>
+          <w:sz w:val="17"/>
+        </w:rPr>
+        <w:t xml:space="preserve">  Primary: CT-NI-RADS Score: [1]. [&lt;No evidence of recurrent disease at the primary site&gt;]</w:t>
+      </w:r>
+    </w:p>
+    <w:p>
+      <w:r>
+        <w:rPr>
+          <w:b w:val="0"/>
+          <w:i w:val="0"/>
+          <w:sz w:val="17"/>
+        </w:rPr>
+        <w:t xml:space="preserve">  Neck: CT-NI-RADS Score: [1]. [&lt;No suspicious adenopathy.&gt;]</w:t>
+      </w:r>
+    </w:p>
+    <w:p>
+      <w:pPr>
+        <w:spacing w:before="160"/>
+      </w:pPr>
+      <w:r>
+        <w:rPr>
+          <w:b/>
+          <w:i w:val="0"/>
+          <w:color w:val="1F3A5F"/>
+          <w:sz w:val="23"/>
+        </w:rPr>
+        <w:t>25-2. Post-treatment Face/Sinus MRI ± PET 템플릿</w:t>
+      </w:r>
+    </w:p>
+    <w:p>
+      <w:r>
+        <w:rPr>
+          <w:b w:val="0"/>
+          <w:i w:val="0"/>
+          <w:sz w:val="17"/>
+        </w:rPr>
+        <w:t>Post-treatment Face/Sinus MRI +/- PET</w:t>
+      </w:r>
+    </w:p>
+    <w:p>
+      <w:r>
+        <w:rPr>
+          <w:b w:val="0"/>
+          <w:i w:val="0"/>
+          <w:sz w:val="17"/>
+        </w:rPr>
+        <w:t>INDICATION / Subsite / HPV or EBV status / Surgery / Chemoradiation: [ ]</w:t>
+      </w:r>
+    </w:p>
+    <w:p>
+      <w:r>
+        <w:rPr>
+          <w:b w:val="0"/>
+          <w:i w:val="0"/>
+          <w:sz w:val="17"/>
+        </w:rPr>
+        <w:t>TECHNIQUE:   COMPARISON: [&lt;None.&gt;]</w:t>
+      </w:r>
+    </w:p>
+    <w:p>
+      <w:r>
+        <w:rPr>
+          <w:b w:val="0"/>
+          <w:i w:val="0"/>
+          <w:sz w:val="17"/>
+        </w:rPr>
+        <w:t>FINDINGS:</w:t>
+      </w:r>
+    </w:p>
+    <w:p>
+      <w:r>
+        <w:rPr>
+          <w:b w:val="0"/>
+          <w:i w:val="0"/>
+          <w:sz w:val="17"/>
+        </w:rPr>
+        <w:t xml:space="preserve">  Primary site: [&lt;No evidence of recurrent disease.&gt;]</w:t>
+      </w:r>
+    </w:p>
+    <w:p>
+      <w:r>
+        <w:rPr>
+          <w:b w:val="0"/>
+          <w:i w:val="0"/>
+          <w:sz w:val="17"/>
+        </w:rPr>
+        <w:t xml:space="preserve">  Perineural disease: [&lt;No evidence of perineural spread of tumor.&gt;]</w:t>
+      </w:r>
+    </w:p>
+    <w:p>
+      <w:r>
+        <w:rPr>
+          <w:b w:val="0"/>
+          <w:i w:val="0"/>
+          <w:sz w:val="17"/>
+        </w:rPr>
+        <w:t xml:space="preserve">  Brain, orbits: [&lt;No evidence of intracranial or intraorbital extension of tumor.&gt;]</w:t>
+      </w:r>
+    </w:p>
+    <w:p>
+      <w:r>
+        <w:rPr>
+          <w:b w:val="0"/>
+          <w:i w:val="0"/>
+          <w:sz w:val="17"/>
+        </w:rPr>
+        <w:t xml:space="preserve">  Upper neck only: [&lt;Incomplete evaluation of regional nodes, but no pathologically enlarged, necrotic, or otherwise abnormal lymph nodes.&gt;]</w:t>
+      </w:r>
+    </w:p>
+    <w:p>
+      <w:r>
+        <w:rPr>
+          <w:b w:val="0"/>
+          <w:i w:val="0"/>
+          <w:sz w:val="17"/>
+        </w:rPr>
+        <w:t xml:space="preserve">  Post-treatment changes: Expected post-treatment changes are noted including [&lt; ... &gt;]</w:t>
+      </w:r>
+    </w:p>
+    <w:p>
+      <w:r>
+        <w:rPr>
+          <w:b w:val="0"/>
+          <w:i w:val="0"/>
+          <w:sz w:val="17"/>
+        </w:rPr>
+        <w:t xml:space="preserve">  Calvarium and spine: [&lt;No aggressive lesions suspicious for metastatic involvement&gt;]</w:t>
+      </w:r>
+    </w:p>
+    <w:p>
+      <w:r>
+        <w:rPr>
+          <w:b w:val="0"/>
+          <w:i w:val="0"/>
+          <w:sz w:val="17"/>
+        </w:rPr>
+        <w:t>IMPRESSION:</w:t>
+      </w:r>
+    </w:p>
+    <w:p>
+      <w:r>
+        <w:rPr>
+          <w:b w:val="0"/>
+          <w:i w:val="0"/>
+          <w:sz w:val="17"/>
+        </w:rPr>
+        <w:t xml:space="preserve">  Primary: MR-NI-RADS Score [1]. [&lt;No evidence of recurrent disease at the primary site&gt;]</w:t>
+      </w:r>
+    </w:p>
+    <w:p>
+      <w:r>
+        <w:rPr>
+          <w:b w:val="0"/>
+          <w:i w:val="0"/>
+          <w:sz w:val="17"/>
+        </w:rPr>
+        <w:t xml:space="preserve">  Neck: MR-NI-RADS Score: [1]. [&lt;No suspicious adenopathy included in the field of view.&gt;]</w:t>
+      </w:r>
+    </w:p>
+    <w:p>
+      <w:pPr>
+        <w:pStyle w:val="ListBullet"/>
+      </w:pPr>
+      <w:r>
+        <w:t>MRI 템플릿의 특징: 'Perineural disease', 'Brain, orbits' 항목이 별도로 있음 → perineural·두개내 확장 평가를 빠뜨리지 않게 함</w:t>
+      </w:r>
+    </w:p>
+    <w:p>
+      <w:r>
+        <w:rPr>
+          <w:b w:val="0"/>
+          <w:i/>
+          <w:color w:val="666666"/>
+          <w:sz w:val="17"/>
+        </w:rPr>
+        <w:t>출처: NI-RADS 보고서 템플릿·Legend·2018 Committee 추적 권고 (ACR NI-RADS 웹페이지 자료, 사용자 제공 이미지)</w:t>
+      </w:r>
+    </w:p>
+    <w:p>
+      <w:pPr>
+        <w:spacing w:before="160"/>
+      </w:pPr>
+      <w:r>
+        <w:rPr>
+          <w:b/>
+          <w:i w:val="0"/>
+          <w:color w:val="1F3A5F"/>
+          <w:sz w:val="23"/>
+        </w:rPr>
+        <w:t>25-3. Legend — PET 없을 때 vs 있을 때</w:t>
+      </w:r>
+    </w:p>
+    <w:tbl>
+      <w:tblPr>
+        <w:tblStyle w:val="TableGrid"/>
+        <w:tblW w:type="auto" w:w="0"/>
+        <w:tblLook w:firstColumn="1" w:firstRow="1" w:lastColumn="0" w:lastRow="0" w:noHBand="0" w:noVBand="1" w:val="04A0"/>
+      </w:tblPr>
+      <w:tblGrid>
+        <w:gridCol w:w="3324"/>
+        <w:gridCol w:w="3324"/>
+        <w:gridCol w:w="3324"/>
+      </w:tblGrid>
+      <w:tr>
+        <w:tc>
+          <w:tcPr>
+            <w:tcW w:type="dxa" w:w="737"/>
+            <w:shd w:val="clear" w:color="auto" w:fill="1F3A5F"/>
+          </w:tcPr>
+          <w:p>
+            <w:r/>
+            <w:r>
+              <w:rPr>
+                <w:b/>
+                <w:color w:val="FFFFFF"/>
+                <w:sz w:val="18"/>
+              </w:rPr>
+              <w:t>Cat.</w:t>
+            </w:r>
+          </w:p>
+        </w:tc>
+        <w:tc>
+          <w:tcPr>
+            <w:tcW w:type="dxa" w:w="4422"/>
+            <w:shd w:val="clear" w:color="auto" w:fill="1F3A5F"/>
+          </w:tcPr>
+          <w:p>
+            <w:r/>
+            <w:r>
+              <w:rPr>
+                <w:b/>
+                <w:color w:val="FFFFFF"/>
+                <w:sz w:val="18"/>
+              </w:rPr>
+              <w:t>CECT 또는 MRI without PET</w:t>
+            </w:r>
+          </w:p>
+        </w:tc>
+        <w:tc>
+          <w:tcPr>
+            <w:tcW w:type="dxa" w:w="4479"/>
+            <w:shd w:val="clear" w:color="auto" w:fill="1F3A5F"/>
+          </w:tcPr>
+          <w:p>
+            <w:r/>
+            <w:r>
+              <w:rPr>
+                <w:b/>
+                <w:color w:val="FFFFFF"/>
+                <w:sz w:val="18"/>
+              </w:rPr>
+              <w:t>CECT 또는 MRI with PET</w:t>
+            </w:r>
+          </w:p>
+        </w:tc>
+      </w:tr>
+      <w:tr>
+        <w:tc>
+          <w:tcPr>
+            <w:tcW w:type="dxa" w:w="737"/>
+          </w:tcPr>
+          <w:p>
+            <w:r/>
+            <w:r>
+              <w:rPr>
+                <w:b/>
+                <w:sz w:val="18"/>
+              </w:rPr>
+              <w:t>P0</w:t>
+            </w:r>
+          </w:p>
+        </w:tc>
+        <w:tc>
+          <w:tcPr>
+            <w:tcW w:type="dxa" w:w="4422"/>
+          </w:tcPr>
+          <w:p>
+            <w:r/>
+            <w:r>
+              <w:rPr>
+                <w:sz w:val="18"/>
+              </w:rPr>
+              <w:t>외부 이전 검사를 판독 시점에 볼 수 없음 → 요청, 확보 후 1–4로 addendum</w:t>
+            </w:r>
+          </w:p>
+        </w:tc>
+        <w:tc>
+          <w:tcPr>
+            <w:tcW w:type="dxa" w:w="4479"/>
+          </w:tcPr>
+          <w:p>
+            <w:r/>
+            <w:r>
+              <w:rPr>
+                <w:sz w:val="18"/>
+              </w:rPr>
+              <w:t>동일</w:t>
+            </w:r>
+          </w:p>
+        </w:tc>
+      </w:tr>
+      <w:tr>
+        <w:tc>
+          <w:tcPr>
+            <w:tcW w:type="dxa" w:w="737"/>
+          </w:tcPr>
+          <w:p>
+            <w:r/>
+            <w:r>
+              <w:rPr>
+                <w:b/>
+                <w:sz w:val="18"/>
+              </w:rPr>
+              <w:t>P1</w:t>
+            </w:r>
+          </w:p>
+        </w:tc>
+        <w:tc>
+          <w:tcPr>
+            <w:tcW w:type="dxa" w:w="4422"/>
+          </w:tcPr>
+          <w:p>
+            <w:r/>
+            <w:r>
+              <w:rPr>
+                <w:sz w:val="18"/>
+              </w:rPr>
+              <w:t>No evidence of recurrence: routine surveillance</w:t>
+            </w:r>
+          </w:p>
+        </w:tc>
+        <w:tc>
+          <w:tcPr>
+            <w:tcW w:type="dxa" w:w="4479"/>
+          </w:tcPr>
+          <w:p>
+            <w:r/>
+            <w:r>
+              <w:rPr>
+                <w:sz w:val="18"/>
+              </w:rPr>
+              <w:t>No evidence of recurrence: routine surveillance, CECT</w:t>
+            </w:r>
+          </w:p>
+        </w:tc>
+      </w:tr>
+      <w:tr>
+        <w:tc>
+          <w:tcPr>
+            <w:tcW w:type="dxa" w:w="737"/>
+          </w:tcPr>
+          <w:p>
+            <w:r/>
+            <w:r>
+              <w:rPr>
+                <w:b/>
+                <w:sz w:val="18"/>
+              </w:rPr>
+              <w:t>P2a</w:t>
+            </w:r>
+          </w:p>
+        </w:tc>
+        <w:tc>
+          <w:tcPr>
+            <w:tcW w:type="dxa" w:w="4422"/>
+          </w:tcPr>
+          <w:p>
+            <w:r/>
+            <w:r>
+              <w:rPr>
+                <w:sz w:val="18"/>
+              </w:rPr>
+              <w:t>Superficial abnormality (skin, mucosal surface): direct visual inspection</w:t>
+            </w:r>
+          </w:p>
+        </w:tc>
+        <w:tc>
+          <w:tcPr>
+            <w:tcW w:type="dxa" w:w="4479"/>
+          </w:tcPr>
+          <w:p>
+            <w:r/>
+            <w:r>
+              <w:rPr>
+                <w:sz w:val="18"/>
+              </w:rPr>
+              <w:t>동일</w:t>
+            </w:r>
+          </w:p>
+        </w:tc>
+      </w:tr>
+      <w:tr>
+        <w:tc>
+          <w:tcPr>
+            <w:tcW w:type="dxa" w:w="737"/>
+          </w:tcPr>
+          <w:p>
+            <w:r/>
+            <w:r>
+              <w:rPr>
+                <w:b/>
+                <w:sz w:val="18"/>
+              </w:rPr>
+              <w:t>P2b</w:t>
+            </w:r>
+          </w:p>
+        </w:tc>
+        <w:tc>
+          <w:tcPr>
+            <w:tcW w:type="dxa" w:w="4422"/>
+          </w:tcPr>
+          <w:p>
+            <w:r/>
+            <w:r>
+              <w:rPr>
+                <w:sz w:val="18"/>
+              </w:rPr>
+              <w:t>Ill-defined deep abnormality: short interval f/u* 또는 PET</w:t>
+            </w:r>
+          </w:p>
+        </w:tc>
+        <w:tc>
+          <w:tcPr>
+            <w:tcW w:type="dxa" w:w="4479"/>
+          </w:tcPr>
+          <w:p>
+            <w:r/>
+            <w:r>
+              <w:rPr>
+                <w:sz w:val="18"/>
+              </w:rPr>
+              <w:t>Ill-defined deep abnormality with only mild FDG: short interval f/u* 또는 routine f/u 때 PET/CECT 재검</w:t>
+            </w:r>
+          </w:p>
+        </w:tc>
+      </w:tr>
+      <w:tr>
+        <w:tc>
+          <w:tcPr>
+            <w:tcW w:type="dxa" w:w="737"/>
+          </w:tcPr>
+          <w:p>
+            <w:r/>
+            <w:r>
+              <w:rPr>
+                <w:b/>
+                <w:sz w:val="18"/>
+              </w:rPr>
+              <w:t>P3</w:t>
+            </w:r>
+          </w:p>
+        </w:tc>
+        <w:tc>
+          <w:tcPr>
+            <w:tcW w:type="dxa" w:w="4422"/>
+          </w:tcPr>
+          <w:p>
+            <w:r/>
+            <w:r>
+              <w:rPr>
+                <w:sz w:val="18"/>
+              </w:rPr>
+              <w:t>High suspicion (new or enlarging discrete nodule/mass): biopsy</w:t>
+            </w:r>
+          </w:p>
+        </w:tc>
+        <w:tc>
+          <w:tcPr>
+            <w:tcW w:type="dxa" w:w="4479"/>
+          </w:tcPr>
+          <w:p>
+            <w:r/>
+            <w:r>
+              <w:rPr>
+                <w:sz w:val="18"/>
+              </w:rPr>
+              <w:t>High suspicion (new or enlarging discrete nodule/mass with intense FDG uptake): biopsy</w:t>
+            </w:r>
+          </w:p>
+        </w:tc>
+      </w:tr>
+      <w:tr>
+        <w:tc>
+          <w:tcPr>
+            <w:tcW w:type="dxa" w:w="737"/>
+          </w:tcPr>
+          <w:p>
+            <w:r/>
+            <w:r>
+              <w:rPr>
+                <w:b/>
+                <w:sz w:val="18"/>
+              </w:rPr>
+              <w:t>P4</w:t>
+            </w:r>
+          </w:p>
+        </w:tc>
+        <w:tc>
+          <w:tcPr>
+            <w:tcW w:type="dxa" w:w="4422"/>
+          </w:tcPr>
+          <w:p>
+            <w:r/>
+            <w:r>
+              <w:rPr>
+                <w:sz w:val="18"/>
+              </w:rPr>
+              <w:t>Definitive recurrence (path proven, clinical 또는 definitive imaging progression)</w:t>
+            </w:r>
+          </w:p>
+        </w:tc>
+        <w:tc>
+          <w:tcPr>
+            <w:tcW w:type="dxa" w:w="4479"/>
+          </w:tcPr>
+          <w:p>
+            <w:r/>
+            <w:r>
+              <w:rPr>
+                <w:sz w:val="18"/>
+              </w:rPr>
+              <w:t>Definitive recurrence (path proven 또는 clinical progression): no biopsy needed</w:t>
+            </w:r>
+          </w:p>
+        </w:tc>
+      </w:tr>
+      <w:tr>
+        <w:tc>
+          <w:tcPr>
+            <w:tcW w:type="dxa" w:w="737"/>
+          </w:tcPr>
+          <w:p>
+            <w:r/>
+            <w:r>
+              <w:rPr>
+                <w:b/>
+                <w:sz w:val="18"/>
+              </w:rPr>
+              <w:t>N0</w:t>
+            </w:r>
+          </w:p>
+        </w:tc>
+        <w:tc>
+          <w:tcPr>
+            <w:tcW w:type="dxa" w:w="4422"/>
+          </w:tcPr>
+          <w:p>
+            <w:r/>
+            <w:r>
+              <w:rPr>
+                <w:sz w:val="18"/>
+              </w:rPr>
+              <w:t>New baseline study: 최종 점수에 이전 검사 필요</w:t>
+            </w:r>
+          </w:p>
+        </w:tc>
+        <w:tc>
+          <w:tcPr>
+            <w:tcW w:type="dxa" w:w="4479"/>
+          </w:tcPr>
+          <w:p>
+            <w:r/>
+            <w:r>
+              <w:rPr>
+                <w:sz w:val="18"/>
+              </w:rPr>
+              <w:t>동일</w:t>
+            </w:r>
+          </w:p>
+        </w:tc>
+      </w:tr>
+      <w:tr>
+        <w:tc>
+          <w:tcPr>
+            <w:tcW w:type="dxa" w:w="737"/>
+          </w:tcPr>
+          <w:p>
+            <w:r/>
+            <w:r>
+              <w:rPr>
+                <w:b/>
+                <w:sz w:val="18"/>
+              </w:rPr>
+              <w:t>N1</w:t>
+            </w:r>
+          </w:p>
+        </w:tc>
+        <w:tc>
+          <w:tcPr>
+            <w:tcW w:type="dxa" w:w="4422"/>
+          </w:tcPr>
+          <w:p>
+            <w:r/>
+            <w:r>
+              <w:rPr>
+                <w:sz w:val="18"/>
+              </w:rPr>
+              <w:t>No evidence of recurrence: routine surveillance</w:t>
+            </w:r>
+          </w:p>
+        </w:tc>
+        <w:tc>
+          <w:tcPr>
+            <w:tcW w:type="dxa" w:w="4479"/>
+          </w:tcPr>
+          <w:p>
+            <w:r/>
+            <w:r>
+              <w:rPr>
+                <w:sz w:val="18"/>
+              </w:rPr>
+              <w:t>동일</w:t>
+            </w:r>
+          </w:p>
+        </w:tc>
+      </w:tr>
+      <w:tr>
+        <w:tc>
+          <w:tcPr>
+            <w:tcW w:type="dxa" w:w="737"/>
+          </w:tcPr>
+          <w:p>
+            <w:r/>
+            <w:r>
+              <w:rPr>
+                <w:b/>
+                <w:sz w:val="18"/>
+              </w:rPr>
+              <w:t>N2</w:t>
+            </w:r>
+          </w:p>
+        </w:tc>
+        <w:tc>
+          <w:tcPr>
+            <w:tcW w:type="dxa" w:w="4422"/>
+          </w:tcPr>
+          <w:p>
+            <w:r/>
+            <w:r>
+              <w:rPr>
+                <w:sz w:val="18"/>
+              </w:rPr>
+              <w:t>Low suspicion (enlarging node without morphologically abnormal features): short interval f/u 또는 PET</w:t>
+            </w:r>
+          </w:p>
+        </w:tc>
+        <w:tc>
+          <w:tcPr>
+            <w:tcW w:type="dxa" w:w="4479"/>
+          </w:tcPr>
+          <w:p>
+            <w:r/>
+            <w:r>
+              <w:rPr>
+                <w:sz w:val="18"/>
+              </w:rPr>
+              <w:t>Low suspicion (residual nodal soft tissue with only mild/intermediate FDG): short interval f/u 또는 routine f/u 때 PET/CECT 재검</w:t>
+            </w:r>
+          </w:p>
+        </w:tc>
+      </w:tr>
+      <w:tr>
+        <w:tc>
+          <w:tcPr>
+            <w:tcW w:type="dxa" w:w="737"/>
+          </w:tcPr>
+          <w:p>
+            <w:r/>
+            <w:r>
+              <w:rPr>
+                <w:b/>
+                <w:sz w:val="18"/>
+              </w:rPr>
+              <w:t>N3</w:t>
+            </w:r>
+          </w:p>
+        </w:tc>
+        <w:tc>
+          <w:tcPr>
+            <w:tcW w:type="dxa" w:w="4422"/>
+          </w:tcPr>
+          <w:p>
+            <w:r/>
+            <w:r>
+              <w:rPr>
+                <w:sz w:val="18"/>
+              </w:rPr>
+              <w:t>High suspicion (new or enlarging node with morphologically abnormal features): biopsy</w:t>
+            </w:r>
+          </w:p>
+        </w:tc>
+        <w:tc>
+          <w:tcPr>
+            <w:tcW w:type="dxa" w:w="4479"/>
+          </w:tcPr>
+          <w:p>
+            <w:r/>
+            <w:r>
+              <w:rPr>
+                <w:sz w:val="18"/>
+              </w:rPr>
+              <w:t>High suspicion (new, enlarging with intense FDG uptake): biopsy</w:t>
+            </w:r>
+          </w:p>
+        </w:tc>
+      </w:tr>
+      <w:tr>
+        <w:tc>
+          <w:tcPr>
+            <w:tcW w:type="dxa" w:w="737"/>
+          </w:tcPr>
+          <w:p>
+            <w:r/>
+            <w:r>
+              <w:rPr>
+                <w:b/>
+                <w:sz w:val="18"/>
+              </w:rPr>
+              <w:t>N4</w:t>
+            </w:r>
+          </w:p>
+        </w:tc>
+        <w:tc>
+          <w:tcPr>
+            <w:tcW w:type="dxa" w:w="4422"/>
+          </w:tcPr>
+          <w:p>
+            <w:r/>
+            <w:r>
+              <w:rPr>
+                <w:sz w:val="18"/>
+              </w:rPr>
+              <w:t>Definitive recurrence: no biopsy needed</w:t>
+            </w:r>
+          </w:p>
+        </w:tc>
+        <w:tc>
+          <w:tcPr>
+            <w:tcW w:type="dxa" w:w="4479"/>
+          </w:tcPr>
+          <w:p>
+            <w:r/>
+            <w:r>
+              <w:rPr>
+                <w:sz w:val="18"/>
+              </w:rPr>
+              <w:t>Definitive recurrence (biopsy proven 또는 clinical progression): no biopsy needed</w:t>
+            </w:r>
+          </w:p>
+        </w:tc>
+      </w:tr>
+    </w:tbl>
+    <w:p/>
+    <w:p>
+      <w:pPr>
+        <w:pStyle w:val="ListBullet"/>
+      </w:pPr>
+      <w:r>
+        <w:t>* Short interval f/u: SCC는 일부 기관에서 3개월. 다른 병리는 외과·종양내과·영상의학과의 판단에 따라 다른 간격 가능</w:t>
+      </w:r>
+    </w:p>
+    <w:p>
+      <w:pPr>
+        <w:pStyle w:val="ListBullet"/>
+      </w:pPr>
+      <w:r>
+        <w:t>{Distant disease}: 전신 PET를 판독할 때 선택적으로 같은 1–4 카테고리 사용</w:t>
+      </w:r>
+    </w:p>
+    <w:p>
+      <w:pPr>
+        <w:pStyle w:val="ListBullet"/>
+      </w:pPr>
+      <w:r>
+        <w:t>핵심 차이: PET가 없으면 형태(new/enlarging discrete, abnormal morphology)로, PET가 있으면 FDG 강도(mild vs intense)로 2와 3을 가름</w:t>
+      </w:r>
+    </w:p>
+    <w:p>
+      <w:r>
+        <w:rPr>
+          <w:b w:val="0"/>
+          <w:i/>
+          <w:color w:val="666666"/>
+          <w:sz w:val="17"/>
+        </w:rPr>
+        <w:t>출처: NI-RADS 보고서 템플릿·Legend·2018 Committee 추적 권고 (ACR NI-RADS 웹페이지 자료, 사용자 제공 이미지)</w:t>
+      </w:r>
+    </w:p>
+    <w:p>
+      <w:pPr>
+        <w:spacing w:before="280"/>
+      </w:pPr>
+      <w:r>
+        <w:rPr>
+          <w:b/>
+          <w:i w:val="0"/>
+          <w:color w:val="1F3A5F"/>
+          <w:sz w:val="28"/>
+        </w:rPr>
+        <w:t>26. NI-RADS Atlas 핵심 정리와 증례</w:t>
+      </w:r>
+    </w:p>
+    <w:p>
+      <w:r>
+        <w:rPr>
+          <w:b w:val="0"/>
+          <w:i w:val="0"/>
+          <w:color w:val="666666"/>
+          <w:sz w:val="17"/>
+        </w:rPr>
+        <w:t>출처: Cavazuti B, Hudgins P, Rath T, Branstetter C, Baugnon K, Corey A, Aiken A. NI-RADS: An Atlas of NI-RADS Categories for Head and Neck Cancer (ACR NI-RADS 웹페이지 자료, 사용자 제공 PDF). Emory 그룹의 교육 자료(참고문헌: Aiken JACR 2016; Krieger AJNR 2017)</w:t>
+      </w:r>
+    </w:p>
+    <w:p>
+      <w:pPr>
+        <w:spacing w:before="160"/>
+      </w:pPr>
+      <w:r>
+        <w:rPr>
+          <w:b/>
+          <w:i w:val="0"/>
+          <w:color w:val="1F3A5F"/>
+          <w:sz w:val="23"/>
+        </w:rPr>
+        <w:t>26-1. Atlas가 강조하는 원칙</w:t>
+      </w:r>
+    </w:p>
+    <w:p>
+      <w:pPr>
+        <w:pStyle w:val="ListBullet"/>
+      </w:pPr>
+      <w:r>
+        <w:t>NI-RADS는 BI-RADS를 모델로, ENT·방사선종양학·혈액종양·병리와 협의해 만든 단순한 의심도 체계</w:t>
+      </w:r>
+    </w:p>
+    <w:p>
+      <w:pPr>
+        <w:pStyle w:val="ListBullet"/>
+      </w:pPr>
+      <w:r>
+        <w:t>관리 선택지는 제한적: routine 추적 / 직접 관찰 또는 단기 추적 / 추가 영상(PET, MR 등) / 조직검사</w:t>
+      </w:r>
+    </w:p>
+    <w:p>
+      <w:pPr>
+        <w:pStyle w:val="ListBullet"/>
+      </w:pPr>
+      <w:r>
+        <w:t>카테고리는 MR에도 쉽게 적용 가능 (Atlas 당시 기준 — 현재는 MRI v2025가 별도로 있음)</w:t>
+      </w:r>
+    </w:p>
+    <w:p>
+      <w:pPr>
+        <w:pStyle w:val="ListBullet"/>
+      </w:pPr>
+      <w:r>
+        <w:t>Primary와 Neck은 관리가 따로이므로 점수도 따로</w:t>
+      </w:r>
+    </w:p>
+    <w:p>
+      <w:pPr>
+        <w:pStyle w:val="ListBullet"/>
+      </w:pPr>
+      <w:r>
+        <w:t>모든 보고서 하단에 legend 포함 → 누구나 해석 가능</w:t>
+      </w:r>
+    </w:p>
+    <w:p>
+      <w:pPr>
+        <w:spacing w:before="160"/>
+      </w:pPr>
+      <w:r>
+        <w:rPr>
+          <w:b/>
+          <w:i w:val="0"/>
+          <w:color w:val="1F3A5F"/>
+          <w:sz w:val="23"/>
+        </w:rPr>
+        <w:t>26-2. 판정 요령 (Atlas pearls)</w:t>
+      </w:r>
+    </w:p>
+    <w:tbl>
+      <w:tblPr>
+        <w:tblStyle w:val="TableGrid"/>
+        <w:tblW w:type="auto" w:w="0"/>
+        <w:tblLook w:firstColumn="1" w:firstRow="1" w:lastColumn="0" w:lastRow="0" w:noHBand="0" w:noVBand="1" w:val="04A0"/>
+      </w:tblPr>
+      <w:tblGrid>
+        <w:gridCol w:w="4986"/>
+        <w:gridCol w:w="4986"/>
+      </w:tblGrid>
+      <w:tr>
+        <w:tc>
+          <w:tcPr>
+            <w:tcW w:type="dxa" w:w="1984"/>
+            <w:shd w:val="clear" w:color="auto" w:fill="1F3A5F"/>
+          </w:tcPr>
+          <w:p>
+            <w:r/>
+            <w:r>
+              <w:rPr>
+                <w:b/>
+                <w:color w:val="FFFFFF"/>
+                <w:sz w:val="18"/>
+              </w:rPr>
+              <w:t>질문</w:t>
+            </w:r>
+          </w:p>
+        </w:tc>
+        <w:tc>
+          <w:tcPr>
+            <w:tcW w:type="dxa" w:w="7654"/>
+            <w:shd w:val="clear" w:color="auto" w:fill="1F3A5F"/>
+          </w:tcPr>
+          <w:p>
+            <w:r/>
+            <w:r>
+              <w:rPr>
+                <w:b/>
+                <w:color w:val="FFFFFF"/>
+                <w:sz w:val="18"/>
+              </w:rPr>
+              <w:t>요령</w:t>
+            </w:r>
+          </w:p>
+        </w:tc>
+      </w:tr>
+      <w:tr>
+        <w:tc>
+          <w:tcPr>
+            <w:tcW w:type="dxa" w:w="1984"/>
+          </w:tcPr>
+          <w:p>
+            <w:r/>
+            <w:r>
+              <w:rPr>
+                <w:b/>
+                <w:sz w:val="18"/>
+              </w:rPr>
+              <w:t>2 vs 3</w:t>
+            </w:r>
+          </w:p>
+        </w:tc>
+        <w:tc>
+          <w:tcPr>
+            <w:tcW w:type="dxa" w:w="7654"/>
+          </w:tcPr>
+          <w:p>
+            <w:r/>
+            <w:r>
+              <w:rPr>
+                <w:sz w:val="18"/>
+              </w:rPr>
+              <w:t>거꾸로 생각하라: 이 병변을 조직검사하고 싶은가? 조직검사할 뚜렷한(discrete) target이 있는가? 없으면 NI-RADS 2</w:t>
+            </w:r>
+          </w:p>
+        </w:tc>
+      </w:tr>
+      <w:tr>
+        <w:tc>
+          <w:tcPr>
+            <w:tcW w:type="dxa" w:w="1984"/>
+          </w:tcPr>
+          <w:p>
+            <w:r/>
+            <w:r>
+              <w:rPr>
+                <w:b/>
+                <w:sz w:val="18"/>
+              </w:rPr>
+              <w:t>3 vs 4</w:t>
+            </w:r>
+          </w:p>
+        </w:tc>
+        <w:tc>
+          <w:tcPr>
+            <w:tcW w:type="dxa" w:w="7654"/>
+          </w:tcPr>
+          <w:p>
+            <w:r/>
+            <w:r>
+              <w:rPr>
+                <w:sz w:val="18"/>
+              </w:rPr>
+              <w:t>거꾸로 생각하라: 조직검사가 필요한가? 다른 가능성이 있는가? 없으면 NI-RADS 4 (단일 검사에서도 definitive recurrence 가능)</w:t>
+            </w:r>
+          </w:p>
+        </w:tc>
+      </w:tr>
+      <w:tr>
+        <w:tc>
+          <w:tcPr>
+            <w:tcW w:type="dxa" w:w="1984"/>
+          </w:tcPr>
+          <w:p>
+            <w:r/>
+            <w:r>
+              <w:rPr>
+                <w:b/>
+                <w:sz w:val="18"/>
+              </w:rPr>
+              <w:t>2가 가장 유용할 때</w:t>
+            </w:r>
+          </w:p>
+        </w:tc>
+        <w:tc>
+          <w:tcPr>
+            <w:tcW w:type="dxa" w:w="7654"/>
+          </w:tcPr>
+          <w:p>
+            <w:r/>
+            <w:r>
+              <w:rPr>
+                <w:sz w:val="18"/>
+              </w:rPr>
+              <w:t>CECT와 PET가 불일치할 때: 강한 조영증강인데 FDG 없음(scar, granulation tissue) / FDG가 강한 궤양(radiation effect)</w:t>
+            </w:r>
+          </w:p>
+        </w:tc>
+      </w:tr>
+      <w:tr>
+        <w:tc>
+          <w:tcPr>
+            <w:tcW w:type="dxa" w:w="1984"/>
+          </w:tcPr>
+          <w:p>
+            <w:r/>
+            <w:r>
+              <w:rPr>
+                <w:b/>
+                <w:sz w:val="18"/>
+              </w:rPr>
+              <w:t>2a의 목적</w:t>
+            </w:r>
+          </w:p>
+        </w:tc>
+        <w:tc>
+          <w:tcPr>
+            <w:tcW w:type="dxa" w:w="7654"/>
+          </w:tcPr>
+          <w:p>
+            <w:r/>
+            <w:r>
+              <w:rPr>
+                <w:sz w:val="18"/>
+              </w:rPr>
+              <w:t>대부분 위양성(17%만 양성). 목적은 임상적 직접 관찰과 필요 시 조직검사를 유도하는 것</w:t>
+            </w:r>
+          </w:p>
+        </w:tc>
+      </w:tr>
+    </w:tbl>
+    <w:p/>
+    <w:p>
+      <w:pPr>
+        <w:spacing w:before="160"/>
+      </w:pPr>
+      <w:r>
+        <w:rPr>
+          <w:b/>
+          <w:i w:val="0"/>
+          <w:color w:val="1F3A5F"/>
+          <w:sz w:val="23"/>
+        </w:rPr>
+        <w:t>26-3. Atlas 증례 요약 (영상은 원본 PDF 참조)</w:t>
+      </w:r>
+    </w:p>
+    <w:tbl>
+      <w:tblPr>
+        <w:tblStyle w:val="TableGrid"/>
+        <w:tblW w:type="auto" w:w="0"/>
+        <w:tblLook w:firstColumn="1" w:firstRow="1" w:lastColumn="0" w:lastRow="0" w:noHBand="0" w:noVBand="1" w:val="04A0"/>
+      </w:tblPr>
+      <w:tblGrid>
+        <w:gridCol w:w="2493"/>
+        <w:gridCol w:w="2493"/>
+        <w:gridCol w:w="2493"/>
+        <w:gridCol w:w="2493"/>
+      </w:tblGrid>
+      <w:tr>
+        <w:tc>
+          <w:tcPr>
+            <w:tcW w:type="dxa" w:w="1134"/>
+            <w:shd w:val="clear" w:color="auto" w:fill="1F3A5F"/>
+          </w:tcPr>
+          <w:p>
+            <w:r/>
+            <w:r>
+              <w:rPr>
+                <w:b/>
+                <w:color w:val="FFFFFF"/>
+                <w:sz w:val="18"/>
+              </w:rPr>
+              <w:t>증례</w:t>
+            </w:r>
+          </w:p>
+        </w:tc>
+        <w:tc>
+          <w:tcPr>
+            <w:tcW w:type="dxa" w:w="2551"/>
+            <w:shd w:val="clear" w:color="auto" w:fill="1F3A5F"/>
+          </w:tcPr>
+          <w:p>
+            <w:r/>
+            <w:r>
+              <w:rPr>
+                <w:b/>
+                <w:color w:val="FFFFFF"/>
+                <w:sz w:val="18"/>
+              </w:rPr>
+              <w:t>배경</w:t>
+            </w:r>
+          </w:p>
+        </w:tc>
+        <w:tc>
+          <w:tcPr>
+            <w:tcW w:type="dxa" w:w="3118"/>
+            <w:shd w:val="clear" w:color="auto" w:fill="1F3A5F"/>
+          </w:tcPr>
+          <w:p>
+            <w:r/>
+            <w:r>
+              <w:rPr>
+                <w:b/>
+                <w:color w:val="FFFFFF"/>
+                <w:sz w:val="18"/>
+              </w:rPr>
+              <w:t>소견</w:t>
+            </w:r>
+          </w:p>
+        </w:tc>
+        <w:tc>
+          <w:tcPr>
+            <w:tcW w:type="dxa" w:w="2835"/>
+            <w:shd w:val="clear" w:color="auto" w:fill="1F3A5F"/>
+          </w:tcPr>
+          <w:p>
+            <w:r/>
+            <w:r>
+              <w:rPr>
+                <w:b/>
+                <w:color w:val="FFFFFF"/>
+                <w:sz w:val="18"/>
+              </w:rPr>
+              <w:t>NI-RADS · 결과</w:t>
+            </w:r>
+          </w:p>
+        </w:tc>
+      </w:tr>
+      <w:tr>
+        <w:tc>
+          <w:tcPr>
+            <w:tcW w:type="dxa" w:w="1134"/>
+          </w:tcPr>
+          <w:p>
+            <w:r/>
+            <w:r>
+              <w:rPr>
+                <w:b/>
+                <w:sz w:val="18"/>
+              </w:rPr>
+              <w:t>예시</w:t>
+            </w:r>
+          </w:p>
+        </w:tc>
+        <w:tc>
+          <w:tcPr>
+            <w:tcW w:type="dxa" w:w="2551"/>
+          </w:tcPr>
+          <w:p>
+            <w:r/>
+            <w:r>
+              <w:rPr>
+                <w:sz w:val="18"/>
+              </w:rPr>
+              <w:t>T1N2c BOT SCC, CRT 후 3개월</w:t>
+            </w:r>
+          </w:p>
+        </w:tc>
+        <w:tc>
+          <w:tcPr>
+            <w:tcW w:type="dxa" w:w="3118"/>
+          </w:tcPr>
+          <w:p>
+            <w:r/>
+            <w:r>
+              <w:rPr>
+                <w:sz w:val="18"/>
+              </w:rPr>
+              <w:t>이상 연부조직 없음, 이상 FDG 없음</w:t>
+            </w:r>
+          </w:p>
+        </w:tc>
+        <w:tc>
+          <w:tcPr>
+            <w:tcW w:type="dxa" w:w="2835"/>
+          </w:tcPr>
+          <w:p>
+            <w:r/>
+            <w:r>
+              <w:rPr>
+                <w:sz w:val="18"/>
+              </w:rPr>
+              <w:t>P1/N1 → 6개월 CECT</w:t>
+            </w:r>
+          </w:p>
+        </w:tc>
+      </w:tr>
+      <w:tr>
+        <w:tc>
+          <w:tcPr>
+            <w:tcW w:type="dxa" w:w="1134"/>
+          </w:tcPr>
+          <w:p>
+            <w:r/>
+            <w:r>
+              <w:rPr>
+                <w:b/>
+                <w:sz w:val="18"/>
+              </w:rPr>
+              <w:t>예시</w:t>
+            </w:r>
+          </w:p>
+        </w:tc>
+        <w:tc>
+          <w:tcPr>
+            <w:tcW w:type="dxa" w:w="2551"/>
+          </w:tcPr>
+          <w:p>
+            <w:r/>
+            <w:r>
+              <w:rPr>
+                <w:sz w:val="18"/>
+              </w:rPr>
+              <w:t>T4a BOT SCC, CRT 후 3개월</w:t>
+            </w:r>
+          </w:p>
+        </w:tc>
+        <w:tc>
+          <w:tcPr>
+            <w:tcW w:type="dxa" w:w="3118"/>
+          </w:tcPr>
+          <w:p>
+            <w:r/>
+            <w:r>
+              <w:rPr>
+                <w:sz w:val="18"/>
+              </w:rPr>
+              <w:t>이상 조영 없음, moderate FDG</w:t>
+            </w:r>
+          </w:p>
+        </w:tc>
+        <w:tc>
+          <w:tcPr>
+            <w:tcW w:type="dxa" w:w="2835"/>
+          </w:tcPr>
+          <w:p>
+            <w:r/>
+            <w:r>
+              <w:rPr>
+                <w:sz w:val="18"/>
+              </w:rPr>
+              <w:t>P2a → 직접 관찰: radiation injury, 추적 PET 음성</w:t>
+            </w:r>
+          </w:p>
+        </w:tc>
+      </w:tr>
+      <w:tr>
+        <w:tc>
+          <w:tcPr>
+            <w:tcW w:type="dxa" w:w="1134"/>
+          </w:tcPr>
+          <w:p>
+            <w:r/>
+            <w:r>
+              <w:rPr>
+                <w:b/>
+                <w:sz w:val="18"/>
+              </w:rPr>
+              <w:t>예시</w:t>
+            </w:r>
+          </w:p>
+        </w:tc>
+        <w:tc>
+          <w:tcPr>
+            <w:tcW w:type="dxa" w:w="2551"/>
+          </w:tcPr>
+          <w:p>
+            <w:r/>
+            <w:r>
+              <w:rPr>
+                <w:sz w:val="18"/>
+              </w:rPr>
+              <w:t>T2N0 성문암 CRT(2011), 추적 소실 후 새 쉰목소리</w:t>
+            </w:r>
+          </w:p>
+        </w:tc>
+        <w:tc>
+          <w:tcPr>
+            <w:tcW w:type="dxa" w:w="3118"/>
+          </w:tcPr>
+          <w:p>
+            <w:r/>
+            <w:r>
+              <w:rPr>
+                <w:sz w:val="18"/>
+              </w:rPr>
+              <w:t>이상 조영 없음, moderate FDG</w:t>
+            </w:r>
+          </w:p>
+        </w:tc>
+        <w:tc>
+          <w:tcPr>
+            <w:tcW w:type="dxa" w:w="2835"/>
+          </w:tcPr>
+          <w:p>
+            <w:r/>
+            <w:r>
+              <w:rPr>
+                <w:sz w:val="18"/>
+              </w:rPr>
+              <w:t>P2a → 직접 관찰·내시경 생검: SCC</w:t>
+            </w:r>
+          </w:p>
+        </w:tc>
+      </w:tr>
+      <w:tr>
+        <w:tc>
+          <w:tcPr>
+            <w:tcW w:type="dxa" w:w="1134"/>
+          </w:tcPr>
+          <w:p>
+            <w:r/>
+            <w:r>
+              <w:rPr>
+                <w:b/>
+                <w:sz w:val="18"/>
+              </w:rPr>
+              <w:t>예시</w:t>
+            </w:r>
+          </w:p>
+        </w:tc>
+        <w:tc>
+          <w:tcPr>
+            <w:tcW w:type="dxa" w:w="2551"/>
+          </w:tcPr>
+          <w:p>
+            <w:r/>
+            <w:r>
+              <w:rPr>
+                <w:sz w:val="18"/>
+              </w:rPr>
+              <w:t>치료 후 2개월, 외부 CECT만</w:t>
+            </w:r>
+          </w:p>
+        </w:tc>
+        <w:tc>
+          <w:tcPr>
+            <w:tcW w:type="dxa" w:w="3118"/>
+          </w:tcPr>
+          <w:p>
+            <w:r/>
+            <w:r>
+              <w:rPr>
+                <w:sz w:val="18"/>
+              </w:rPr>
+              <w:t>커진 우측 IIa node, central necrosis</w:t>
+            </w:r>
+          </w:p>
+        </w:tc>
+        <w:tc>
+          <w:tcPr>
+            <w:tcW w:type="dxa" w:w="2835"/>
+          </w:tcPr>
+          <w:p>
+            <w:r/>
+            <w:r>
+              <w:rPr>
+                <w:sz w:val="18"/>
+              </w:rPr>
+              <w:t>N2 → PET 권고. 구제 경부절제 음성 (현재라면 경부절제 전 PET)</w:t>
+            </w:r>
+          </w:p>
+        </w:tc>
+      </w:tr>
+      <w:tr>
+        <w:tc>
+          <w:tcPr>
+            <w:tcW w:type="dxa" w:w="1134"/>
+          </w:tcPr>
+          <w:p>
+            <w:r/>
+            <w:r>
+              <w:rPr>
+                <w:b/>
+                <w:sz w:val="18"/>
+              </w:rPr>
+              <w:t>예시</w:t>
+            </w:r>
+          </w:p>
+        </w:tc>
+        <w:tc>
+          <w:tcPr>
+            <w:tcW w:type="dxa" w:w="2551"/>
+          </w:tcPr>
+          <w:p>
+            <w:r/>
+            <w:r>
+              <w:rPr>
+                <w:sz w:val="18"/>
+              </w:rPr>
+              <w:t>상악 SCC, 절제+CRT 후 4개월</w:t>
+            </w:r>
+          </w:p>
+        </w:tc>
+        <w:tc>
+          <w:tcPr>
+            <w:tcW w:type="dxa" w:w="3118"/>
+          </w:tcPr>
+          <w:p>
+            <w:r/>
+            <w:r>
+              <w:rPr>
+                <w:sz w:val="18"/>
+              </w:rPr>
+              <w:t>골미란 동반 국소 이상 연부조직, intense FDG</w:t>
+            </w:r>
+          </w:p>
+        </w:tc>
+        <w:tc>
+          <w:tcPr>
+            <w:tcW w:type="dxa" w:w="2835"/>
+          </w:tcPr>
+          <w:p>
+            <w:r/>
+            <w:r>
+              <w:rPr>
+                <w:sz w:val="18"/>
+              </w:rPr>
+              <w:t>P3 → CT 유도 생검: 잔존 SCC</w:t>
+            </w:r>
+          </w:p>
+        </w:tc>
+      </w:tr>
+      <w:tr>
+        <w:tc>
+          <w:tcPr>
+            <w:tcW w:type="dxa" w:w="1134"/>
+          </w:tcPr>
+          <w:p>
+            <w:r/>
+            <w:r>
+              <w:rPr>
+                <w:b/>
+                <w:sz w:val="18"/>
+              </w:rPr>
+              <w:t>예시</w:t>
+            </w:r>
+          </w:p>
+        </w:tc>
+        <w:tc>
+          <w:tcPr>
+            <w:tcW w:type="dxa" w:w="2551"/>
+          </w:tcPr>
+          <w:p>
+            <w:r/>
+            <w:r>
+              <w:rPr>
+                <w:sz w:val="18"/>
+              </w:rPr>
+              <w:t>T4aN0 후두암 TL·양측 ND·CRT 후</w:t>
+            </w:r>
+          </w:p>
+        </w:tc>
+        <w:tc>
+          <w:tcPr>
+            <w:tcW w:type="dxa" w:w="3118"/>
+          </w:tcPr>
+          <w:p>
+            <w:r/>
+            <w:r>
+              <w:rPr>
+                <w:sz w:val="18"/>
+              </w:rPr>
+              <w:t>국소 이상 조영, intense FDG</w:t>
+            </w:r>
+          </w:p>
+        </w:tc>
+        <w:tc>
+          <w:tcPr>
+            <w:tcW w:type="dxa" w:w="2835"/>
+          </w:tcPr>
+          <w:p>
+            <w:r/>
+            <w:r>
+              <w:rPr>
+                <w:sz w:val="18"/>
+              </w:rPr>
+              <w:t>P3 → 내시경 생검: 재발</w:t>
+            </w:r>
+          </w:p>
+        </w:tc>
+      </w:tr>
+      <w:tr>
+        <w:tc>
+          <w:tcPr>
+            <w:tcW w:type="dxa" w:w="1134"/>
+          </w:tcPr>
+          <w:p>
+            <w:r/>
+            <w:r>
+              <w:rPr>
+                <w:b/>
+                <w:sz w:val="18"/>
+              </w:rPr>
+              <w:t>예시</w:t>
+            </w:r>
+          </w:p>
+        </w:tc>
+        <w:tc>
+          <w:tcPr>
+            <w:tcW w:type="dxa" w:w="2551"/>
+          </w:tcPr>
+          <w:p>
+            <w:r/>
+            <w:r>
+              <w:rPr>
+                <w:sz w:val="18"/>
+              </w:rPr>
+              <w:t>T2N2b 구강 설암, 절제·ND·CRT 후 9개월</w:t>
+            </w:r>
+          </w:p>
+        </w:tc>
+        <w:tc>
+          <w:tcPr>
+            <w:tcW w:type="dxa" w:w="3118"/>
+          </w:tcPr>
+          <w:p>
+            <w:r/>
+            <w:r>
+              <w:rPr>
+                <w:sz w:val="18"/>
+              </w:rPr>
+              <w:t>커지는 이상 LN, intense FDG</w:t>
+            </w:r>
+          </w:p>
+        </w:tc>
+        <w:tc>
+          <w:tcPr>
+            <w:tcW w:type="dxa" w:w="2835"/>
+          </w:tcPr>
+          <w:p>
+            <w:r/>
+            <w:r>
+              <w:rPr>
+                <w:sz w:val="18"/>
+              </w:rPr>
+              <w:t>N3 → 재경부절제: 재발</w:t>
+            </w:r>
+          </w:p>
+        </w:tc>
+      </w:tr>
+      <w:tr>
+        <w:tc>
+          <w:tcPr>
+            <w:tcW w:type="dxa" w:w="1134"/>
+          </w:tcPr>
+          <w:p>
+            <w:r/>
+            <w:r>
+              <w:rPr>
+                <w:b/>
+                <w:sz w:val="18"/>
+              </w:rPr>
+              <w:t>예시</w:t>
+            </w:r>
+          </w:p>
+        </w:tc>
+        <w:tc>
+          <w:tcPr>
+            <w:tcW w:type="dxa" w:w="2551"/>
+          </w:tcPr>
+          <w:p>
+            <w:r/>
+            <w:r>
+              <w:rPr>
+                <w:sz w:val="18"/>
+              </w:rPr>
+              <w:t>pT4aN2c 후두암 TL·양측 ND 후</w:t>
+            </w:r>
+          </w:p>
+        </w:tc>
+        <w:tc>
+          <w:tcPr>
+            <w:tcW w:type="dxa" w:w="3118"/>
+          </w:tcPr>
+          <w:p>
+            <w:r/>
+            <w:r>
+              <w:rPr>
+                <w:sz w:val="18"/>
+              </w:rPr>
+              <w:t>우측 경부/stoma 병변</w:t>
+            </w:r>
+          </w:p>
+        </w:tc>
+        <w:tc>
+          <w:tcPr>
+            <w:tcW w:type="dxa" w:w="2835"/>
+          </w:tcPr>
+          <w:p>
+            <w:r/>
+            <w:r>
+              <w:rPr>
+                <w:sz w:val="18"/>
+              </w:rPr>
+              <w:t>N4 (병리 확인 또는 명백한 진행)</w:t>
+            </w:r>
+          </w:p>
+        </w:tc>
+      </w:tr>
+      <w:tr>
+        <w:tc>
+          <w:tcPr>
+            <w:tcW w:type="dxa" w:w="1134"/>
+          </w:tcPr>
+          <w:p>
+            <w:r/>
+            <w:r>
+              <w:rPr>
+                <w:b/>
+                <w:sz w:val="18"/>
+              </w:rPr>
+              <w:t>Unknown 1</w:t>
+            </w:r>
+          </w:p>
+        </w:tc>
+        <w:tc>
+          <w:tcPr>
+            <w:tcW w:type="dxa" w:w="2551"/>
+          </w:tcPr>
+          <w:p>
+            <w:r/>
+            <w:r>
+              <w:rPr>
+                <w:sz w:val="18"/>
+              </w:rPr>
+              <w:t>pT1N2c 좌 GTS SCC, TORS+ND 후 5개월</w:t>
+            </w:r>
+          </w:p>
+        </w:tc>
+        <w:tc>
+          <w:tcPr>
+            <w:tcW w:type="dxa" w:w="3118"/>
+          </w:tcPr>
+          <w:p>
+            <w:r/>
+            <w:r>
+              <w:rPr>
+                <w:sz w:val="18"/>
+              </w:rPr>
+              <w:t>궤양 + focal mucosal FDG (불일치)</w:t>
+            </w:r>
+          </w:p>
+        </w:tc>
+        <w:tc>
+          <w:tcPr>
+            <w:tcW w:type="dxa" w:w="2835"/>
+          </w:tcPr>
+          <w:p>
+            <w:r/>
+            <w:r>
+              <w:rPr>
+                <w:sz w:val="18"/>
+              </w:rPr>
+              <w:t>P2a → 직접 관찰: 재발 소견 없음</w:t>
+            </w:r>
+          </w:p>
+        </w:tc>
+      </w:tr>
+      <w:tr>
+        <w:tc>
+          <w:tcPr>
+            <w:tcW w:type="dxa" w:w="1134"/>
+          </w:tcPr>
+          <w:p>
+            <w:r/>
+            <w:r>
+              <w:rPr>
+                <w:b/>
+                <w:sz w:val="18"/>
+              </w:rPr>
+              <w:t>Unknown 2</w:t>
+            </w:r>
+          </w:p>
+        </w:tc>
+        <w:tc>
+          <w:tcPr>
+            <w:tcW w:type="dxa" w:w="2551"/>
+          </w:tcPr>
+          <w:p>
+            <w:r/>
+            <w:r>
+              <w:rPr>
+                <w:sz w:val="18"/>
+              </w:rPr>
+              <w:t>T4aN2b 설암, 절제 후 4개월</w:t>
+            </w:r>
+          </w:p>
+        </w:tc>
+        <w:tc>
+          <w:tcPr>
+            <w:tcW w:type="dxa" w:w="3118"/>
+          </w:tcPr>
+          <w:p>
+            <w:r/>
+            <w:r>
+              <w:rPr>
+                <w:sz w:val="18"/>
+              </w:rPr>
+              <w:t>Flap을 따라 이상 조영·결절 없음, FDG 없음</w:t>
+            </w:r>
+          </w:p>
+        </w:tc>
+        <w:tc>
+          <w:tcPr>
+            <w:tcW w:type="dxa" w:w="2835"/>
+          </w:tcPr>
+          <w:p>
+            <w:r/>
+            <w:r>
+              <w:rPr>
+                <w:sz w:val="18"/>
+              </w:rPr>
+              <w:t>P1</w:t>
+            </w:r>
+          </w:p>
+        </w:tc>
+      </w:tr>
+      <w:tr>
+        <w:tc>
+          <w:tcPr>
+            <w:tcW w:type="dxa" w:w="1134"/>
+          </w:tcPr>
+          <w:p>
+            <w:r/>
+            <w:r>
+              <w:rPr>
+                <w:b/>
+                <w:sz w:val="18"/>
+              </w:rPr>
+              <w:t>Unknown 3</w:t>
+            </w:r>
+          </w:p>
+        </w:tc>
+        <w:tc>
+          <w:tcPr>
+            <w:tcW w:type="dxa" w:w="2551"/>
+          </w:tcPr>
+          <w:p>
+            <w:r/>
+            <w:r>
+              <w:rPr>
+                <w:sz w:val="18"/>
+              </w:rPr>
+              <w:t>비강 alveolar rhabdomyosarcoma, 장기 추적</w:t>
+            </w:r>
+          </w:p>
+        </w:tc>
+        <w:tc>
+          <w:tcPr>
+            <w:tcW w:type="dxa" w:w="3118"/>
+          </w:tcPr>
+          <w:p>
+            <w:r/>
+            <w:r>
+              <w:rPr>
+                <w:sz w:val="18"/>
+              </w:rPr>
+              <w:t>새 mass, intense FDG</w:t>
+            </w:r>
+          </w:p>
+        </w:tc>
+        <w:tc>
+          <w:tcPr>
+            <w:tcW w:type="dxa" w:w="2835"/>
+          </w:tcPr>
+          <w:p>
+            <w:r/>
+            <w:r>
+              <w:rPr>
+                <w:sz w:val="18"/>
+              </w:rPr>
+              <w:t>N3 → CT 유도 생검: 재발</w:t>
+            </w:r>
+          </w:p>
+        </w:tc>
+      </w:tr>
+      <w:tr>
+        <w:tc>
+          <w:tcPr>
+            <w:tcW w:type="dxa" w:w="1134"/>
+          </w:tcPr>
+          <w:p>
+            <w:r/>
+            <w:r>
+              <w:rPr>
+                <w:b/>
+                <w:sz w:val="18"/>
+              </w:rPr>
+              <w:t>Unknown 4</w:t>
+            </w:r>
+          </w:p>
+        </w:tc>
+        <w:tc>
+          <w:tcPr>
+            <w:tcW w:type="dxa" w:w="2551"/>
+          </w:tcPr>
+          <w:p>
+            <w:r/>
+            <w:r>
+              <w:rPr>
+                <w:sz w:val="18"/>
+              </w:rPr>
+              <w:t>T1N2c BOT SCC, CRT 후 6개월</w:t>
+            </w:r>
+          </w:p>
+        </w:tc>
+        <w:tc>
+          <w:tcPr>
+            <w:tcW w:type="dxa" w:w="3118"/>
+          </w:tcPr>
+          <w:p>
+            <w:r/>
+            <w:r>
+              <w:rPr>
+                <w:sz w:val="18"/>
+              </w:rPr>
+              <w:t>이상 점막 조영 없음, FDG 없음</w:t>
+            </w:r>
+          </w:p>
+        </w:tc>
+        <w:tc>
+          <w:tcPr>
+            <w:tcW w:type="dxa" w:w="2835"/>
+          </w:tcPr>
+          <w:p>
+            <w:r/>
+            <w:r>
+              <w:rPr>
+                <w:sz w:val="18"/>
+              </w:rPr>
+              <w:t>P1/N1</w:t>
+            </w:r>
+          </w:p>
+        </w:tc>
+      </w:tr>
+      <w:tr>
+        <w:tc>
+          <w:tcPr>
+            <w:tcW w:type="dxa" w:w="1134"/>
+          </w:tcPr>
+          <w:p>
+            <w:r/>
+            <w:r>
+              <w:rPr>
+                <w:b/>
+                <w:sz w:val="18"/>
+              </w:rPr>
+              <w:t>Unknown 5</w:t>
+            </w:r>
+          </w:p>
+        </w:tc>
+        <w:tc>
+          <w:tcPr>
+            <w:tcW w:type="dxa" w:w="2551"/>
+          </w:tcPr>
+          <w:p>
+            <w:r/>
+            <w:r>
+              <w:rPr>
+                <w:sz w:val="18"/>
+              </w:rPr>
+              <w:t>rypT4bN0 연구개 SCC, 광범위 절제 후</w:t>
+            </w:r>
+          </w:p>
+        </w:tc>
+        <w:tc>
+          <w:tcPr>
+            <w:tcW w:type="dxa" w:w="3118"/>
+          </w:tcPr>
+          <w:p>
+            <w:r/>
+            <w:r>
+              <w:rPr>
+                <w:sz w:val="18"/>
+              </w:rPr>
+              <w:t>Discrete mass-like tissue + intense FDG → 추적 소실 후 크기·FDG 증가</w:t>
+            </w:r>
+          </w:p>
+        </w:tc>
+        <w:tc>
+          <w:tcPr>
+            <w:tcW w:type="dxa" w:w="2835"/>
+          </w:tcPr>
+          <w:p>
+            <w:r/>
+            <w:r>
+              <w:rPr>
+                <w:sz w:val="18"/>
+              </w:rPr>
+              <w:t>N3 → 이후 명백한 진행으로 N4; CT 유도 생검 양성</w:t>
+            </w:r>
+          </w:p>
+        </w:tc>
+      </w:tr>
+      <w:tr>
+        <w:tc>
+          <w:tcPr>
+            <w:tcW w:type="dxa" w:w="1134"/>
+          </w:tcPr>
+          <w:p>
+            <w:r/>
+            <w:r>
+              <w:rPr>
+                <w:b/>
+                <w:sz w:val="18"/>
+              </w:rPr>
+              <w:t>Unknown 6</w:t>
+            </w:r>
+          </w:p>
+        </w:tc>
+        <w:tc>
+          <w:tcPr>
+            <w:tcW w:type="dxa" w:w="2551"/>
+          </w:tcPr>
+          <w:p>
+            <w:r/>
+            <w:r>
+              <w:rPr>
+                <w:sz w:val="18"/>
+              </w:rPr>
+              <w:t>pT1N2a 편도 SCC, TORS+ND+CRT 후 4개월</w:t>
+            </w:r>
+          </w:p>
+        </w:tc>
+        <w:tc>
+          <w:tcPr>
+            <w:tcW w:type="dxa" w:w="3118"/>
+          </w:tcPr>
+          <w:p>
+            <w:r/>
+            <w:r>
+              <w:rPr>
+                <w:sz w:val="18"/>
+              </w:rPr>
+              <w:t>좌 submandibular 수술 clip 옆 nodular ill-defined 조영, mild FDG</w:t>
+            </w:r>
+          </w:p>
+        </w:tc>
+        <w:tc>
+          <w:tcPr>
+            <w:tcW w:type="dxa" w:w="2835"/>
+          </w:tcPr>
+          <w:p>
+            <w:r/>
+            <w:r>
+              <w:rPr>
+                <w:sz w:val="18"/>
+              </w:rPr>
+              <w:t>N2 → 7개월에 크기 불변·FDG 감소 → N1. 잔존 submandibular gland로 판단</w:t>
+            </w:r>
+          </w:p>
+        </w:tc>
+      </w:tr>
+      <w:tr>
+        <w:tc>
+          <w:tcPr>
+            <w:tcW w:type="dxa" w:w="1134"/>
+          </w:tcPr>
+          <w:p>
+            <w:r/>
+            <w:r>
+              <w:rPr>
+                <w:b/>
+                <w:sz w:val="18"/>
+              </w:rPr>
+              <w:t>Unknown 7</w:t>
+            </w:r>
+          </w:p>
+        </w:tc>
+        <w:tc>
+          <w:tcPr>
+            <w:tcW w:type="dxa" w:w="2551"/>
+          </w:tcPr>
+          <w:p>
+            <w:r/>
+            <w:r>
+              <w:rPr>
+                <w:sz w:val="18"/>
+              </w:rPr>
+              <w:t>재발 BOT SCC, TL·pec flap·우 ND 후</w:t>
+            </w:r>
+          </w:p>
+        </w:tc>
+        <w:tc>
+          <w:tcPr>
+            <w:tcW w:type="dxa" w:w="3118"/>
+          </w:tcPr>
+          <w:p>
+            <w:r/>
+            <w:r>
+              <w:rPr>
+                <w:sz w:val="18"/>
+              </w:rPr>
+              <w:t>좌 level IV 부위 이상 연부조직 → PET/CT에서 intense FDG</w:t>
+            </w:r>
+          </w:p>
+        </w:tc>
+        <w:tc>
+          <w:tcPr>
+            <w:tcW w:type="dxa" w:w="2835"/>
+          </w:tcPr>
+          <w:p>
+            <w:r/>
+            <w:r>
+              <w:rPr>
+                <w:sz w:val="18"/>
+              </w:rPr>
+              <w:t>N2(PET 권고) → N3 → CT 유도 생검: SCC</w:t>
+            </w:r>
+          </w:p>
+        </w:tc>
+      </w:tr>
+      <w:tr>
+        <w:tc>
+          <w:tcPr>
+            <w:tcW w:type="dxa" w:w="1134"/>
+          </w:tcPr>
+          <w:p>
+            <w:r/>
+            <w:r>
+              <w:rPr>
+                <w:b/>
+                <w:sz w:val="18"/>
+              </w:rPr>
+              <w:t>Unknown 8</w:t>
+            </w:r>
+          </w:p>
+        </w:tc>
+        <w:tc>
+          <w:tcPr>
+            <w:tcW w:type="dxa" w:w="2551"/>
+          </w:tcPr>
+          <w:p>
+            <w:r/>
+            <w:r>
+              <w:rPr>
+                <w:sz w:val="18"/>
+              </w:rPr>
+              <w:t>T4N0 상악동 myoepithelial carcinoma, 복합 절제 후</w:t>
+            </w:r>
+          </w:p>
+        </w:tc>
+        <w:tc>
+          <w:tcPr>
+            <w:tcW w:type="dxa" w:w="3118"/>
+          </w:tcPr>
+          <w:p>
+            <w:r/>
+            <w:r>
+              <w:rPr>
+                <w:sz w:val="18"/>
+              </w:rPr>
+              <w:t>Discrete 연부조직 + focal FDG</w:t>
+            </w:r>
+          </w:p>
+        </w:tc>
+        <w:tc>
+          <w:tcPr>
+            <w:tcW w:type="dxa" w:w="2835"/>
+          </w:tcPr>
+          <w:p>
+            <w:r/>
+            <w:r>
+              <w:rPr>
+                <w:sz w:val="18"/>
+              </w:rPr>
+              <w:t>P3 → 생검 음성 → 4개월 후 호전 → P2a. 치료 관련 변화</w:t>
+            </w:r>
+          </w:p>
+        </w:tc>
+      </w:tr>
+      <w:tr>
+        <w:tc>
+          <w:tcPr>
+            <w:tcW w:type="dxa" w:w="1134"/>
+          </w:tcPr>
+          <w:p>
+            <w:r/>
+            <w:r>
+              <w:rPr>
+                <w:b/>
+                <w:sz w:val="18"/>
+              </w:rPr>
+              <w:t>Unknown 9</w:t>
+            </w:r>
+          </w:p>
+        </w:tc>
+        <w:tc>
+          <w:tcPr>
+            <w:tcW w:type="dxa" w:w="2551"/>
+          </w:tcPr>
+          <w:p>
+            <w:r/>
+            <w:r>
+              <w:rPr>
+                <w:sz w:val="18"/>
+              </w:rPr>
+              <w:t>Transglottic 성문상부 SCC, TL 후 4개월</w:t>
+            </w:r>
+          </w:p>
+        </w:tc>
+        <w:tc>
+          <w:tcPr>
+            <w:tcW w:type="dxa" w:w="3118"/>
+          </w:tcPr>
+          <w:p>
+            <w:r/>
+            <w:r>
+              <w:rPr>
+                <w:sz w:val="18"/>
+              </w:rPr>
+              <w:t>Differential enhancement 있는 discrete 병변 + intense FDG</w:t>
+            </w:r>
+          </w:p>
+        </w:tc>
+        <w:tc>
+          <w:tcPr>
+            <w:tcW w:type="dxa" w:w="2835"/>
+          </w:tcPr>
+          <w:p>
+            <w:r/>
+            <w:r>
+              <w:rPr>
+                <w:sz w:val="18"/>
+              </w:rPr>
+              <w:t>P3 → 임상 생검: 재발</w:t>
+            </w:r>
+          </w:p>
+        </w:tc>
+      </w:tr>
+      <w:tr>
+        <w:tc>
+          <w:tcPr>
+            <w:tcW w:type="dxa" w:w="1134"/>
+          </w:tcPr>
+          <w:p>
+            <w:r/>
+            <w:r>
+              <w:rPr>
+                <w:b/>
+                <w:sz w:val="18"/>
+              </w:rPr>
+              <w:t>Unknown 10</w:t>
+            </w:r>
+          </w:p>
+        </w:tc>
+        <w:tc>
+          <w:tcPr>
+            <w:tcW w:type="dxa" w:w="2551"/>
+          </w:tcPr>
+          <w:p>
+            <w:r/>
+            <w:r>
+              <w:rPr>
+                <w:sz w:val="18"/>
+              </w:rPr>
+              <w:t>비인두암, CRT 후 4개월</w:t>
+            </w:r>
+          </w:p>
+        </w:tc>
+        <w:tc>
+          <w:tcPr>
+            <w:tcW w:type="dxa" w:w="3118"/>
+          </w:tcPr>
+          <w:p>
+            <w:r/>
+            <w:r>
+              <w:rPr>
+                <w:sz w:val="18"/>
+              </w:rPr>
+              <w:t>Non-mass-like distortion, FDG 없음</w:t>
+            </w:r>
+          </w:p>
+        </w:tc>
+        <w:tc>
+          <w:tcPr>
+            <w:tcW w:type="dxa" w:w="2835"/>
+          </w:tcPr>
+          <w:p>
+            <w:r/>
+            <w:r>
+              <w:rPr>
+                <w:sz w:val="18"/>
+              </w:rPr>
+              <w:t>P1</w:t>
+            </w:r>
+          </w:p>
+        </w:tc>
+      </w:tr>
+      <w:tr>
+        <w:tc>
+          <w:tcPr>
+            <w:tcW w:type="dxa" w:w="1134"/>
+          </w:tcPr>
+          <w:p>
+            <w:r/>
+            <w:r>
+              <w:rPr>
+                <w:b/>
+                <w:sz w:val="18"/>
+              </w:rPr>
+              <w:t>Unknown 11</w:t>
+            </w:r>
+          </w:p>
+        </w:tc>
+        <w:tc>
+          <w:tcPr>
+            <w:tcW w:type="dxa" w:w="2551"/>
+          </w:tcPr>
+          <w:p>
+            <w:r/>
+            <w:r>
+              <w:rPr>
+                <w:sz w:val="18"/>
+              </w:rPr>
+              <w:t>우 구인두 SCC</w:t>
+            </w:r>
+          </w:p>
+        </w:tc>
+        <w:tc>
+          <w:tcPr>
+            <w:tcW w:type="dxa" w:w="3118"/>
+          </w:tcPr>
+          <w:p>
+            <w:r/>
+            <w:r>
+              <w:rPr>
+                <w:sz w:val="18"/>
+              </w:rPr>
+              <w:t>3개월: focal mucosal 조영 + mild FDG → 6개월: 명확히 커지는 mass + intense FDG</w:t>
+            </w:r>
+          </w:p>
+        </w:tc>
+        <w:tc>
+          <w:tcPr>
+            <w:tcW w:type="dxa" w:w="2835"/>
+          </w:tcPr>
+          <w:p>
+            <w:r/>
+            <w:r>
+              <w:rPr>
+                <w:sz w:val="18"/>
+              </w:rPr>
+              <w:t>P2a → P3 → 임상 생검: 재발</w:t>
+            </w:r>
+          </w:p>
+        </w:tc>
+      </w:tr>
+      <w:tr>
+        <w:tc>
+          <w:tcPr>
+            <w:tcW w:type="dxa" w:w="1134"/>
+          </w:tcPr>
+          <w:p>
+            <w:r/>
+            <w:r>
+              <w:rPr>
+                <w:b/>
+                <w:sz w:val="18"/>
+              </w:rPr>
+              <w:t>Unknown 12</w:t>
+            </w:r>
+          </w:p>
+        </w:tc>
+        <w:tc>
+          <w:tcPr>
+            <w:tcW w:type="dxa" w:w="2551"/>
+          </w:tcPr>
+          <w:p>
+            <w:r/>
+            <w:r>
+              <w:rPr>
+                <w:sz w:val="18"/>
+              </w:rPr>
+              <w:t>HPV+ 편도 SCC, 양측 전이 LN</w:t>
+            </w:r>
+          </w:p>
+        </w:tc>
+        <w:tc>
+          <w:tcPr>
+            <w:tcW w:type="dxa" w:w="3118"/>
+          </w:tcPr>
+          <w:p>
+            <w:r/>
+            <w:r>
+              <w:rPr>
+                <w:sz w:val="18"/>
+              </w:rPr>
+              <w:t>3개월: 이상 결절성 조영 + mild FDG → 6개월: FDG 없음</w:t>
+            </w:r>
+          </w:p>
+        </w:tc>
+        <w:tc>
+          <w:tcPr>
+            <w:tcW w:type="dxa" w:w="2835"/>
+          </w:tcPr>
+          <w:p>
+            <w:r/>
+            <w:r>
+              <w:rPr>
+                <w:sz w:val="18"/>
+              </w:rPr>
+              <w:t>N2 → N1</w:t>
+            </w:r>
+          </w:p>
+        </w:tc>
+      </w:tr>
+      <w:tr>
+        <w:tc>
+          <w:tcPr>
+            <w:tcW w:type="dxa" w:w="1134"/>
+          </w:tcPr>
+          <w:p>
+            <w:r/>
+            <w:r>
+              <w:rPr>
+                <w:b/>
+                <w:sz w:val="18"/>
+              </w:rPr>
+              <w:t>Unknown 13</w:t>
+            </w:r>
+          </w:p>
+        </w:tc>
+        <w:tc>
+          <w:tcPr>
+            <w:tcW w:type="dxa" w:w="2551"/>
+          </w:tcPr>
+          <w:p>
+            <w:r/>
+            <w:r>
+              <w:rPr>
+                <w:sz w:val="18"/>
+              </w:rPr>
+              <w:t>우 편도 SCC</w:t>
+            </w:r>
+          </w:p>
+        </w:tc>
+        <w:tc>
+          <w:tcPr>
+            <w:tcW w:type="dxa" w:w="3118"/>
+          </w:tcPr>
+          <w:p>
+            <w:r/>
+            <w:r>
+              <w:rPr>
+                <w:sz w:val="18"/>
+              </w:rPr>
+              <w:t>3개월: focal mucosal 조영 + mild FDG → 6개월: FDG 없음</w:t>
+            </w:r>
+          </w:p>
+        </w:tc>
+        <w:tc>
+          <w:tcPr>
+            <w:tcW w:type="dxa" w:w="2835"/>
+          </w:tcPr>
+          <w:p>
+            <w:r/>
+            <w:r>
+              <w:rPr>
+                <w:sz w:val="18"/>
+              </w:rPr>
+              <w:t>P2a → P1</w:t>
+            </w:r>
+          </w:p>
+        </w:tc>
+      </w:tr>
+      <w:tr>
+        <w:tc>
+          <w:tcPr>
+            <w:tcW w:type="dxa" w:w="1134"/>
+          </w:tcPr>
+          <w:p>
+            <w:r/>
+            <w:r>
+              <w:rPr>
+                <w:b/>
+                <w:sz w:val="18"/>
+              </w:rPr>
+              <w:t>Unknown 14</w:t>
+            </w:r>
+          </w:p>
+        </w:tc>
+        <w:tc>
+          <w:tcPr>
+            <w:tcW w:type="dxa" w:w="2551"/>
+          </w:tcPr>
+          <w:p>
+            <w:r/>
+            <w:r>
+              <w:rPr>
+                <w:sz w:val="18"/>
+              </w:rPr>
+              <w:t>R BOT SCC, 양측 전이 LN</w:t>
+            </w:r>
+          </w:p>
+        </w:tc>
+        <w:tc>
+          <w:tcPr>
+            <w:tcW w:type="dxa" w:w="3118"/>
+          </w:tcPr>
+          <w:p>
+            <w:r/>
+            <w:r>
+              <w:rPr>
+                <w:sz w:val="18"/>
+              </w:rPr>
+              <w:t>3개월: focal mucosal 조영·mild FDG, 지속 커진 node(FDG 없음) → 6개월 P1, N2</w:t>
+            </w:r>
+          </w:p>
+        </w:tc>
+        <w:tc>
+          <w:tcPr>
+            <w:tcW w:type="dxa" w:w="2835"/>
+          </w:tcPr>
+          <w:p>
+            <w:r/>
+            <w:r>
+              <w:rPr>
+                <w:sz w:val="18"/>
+              </w:rPr>
+              <w:t>P2a/N2 → 기능 상실 후두로 CRT 8개월에 TL + 구제 ND: LN 2개에 잔존 SCC</w:t>
+            </w:r>
+          </w:p>
+        </w:tc>
+      </w:tr>
+    </w:tbl>
+    <w:p/>
+    <w:tbl>
+      <w:tblPr>
+        <w:tblStyle w:val="TableGrid"/>
+        <w:tblW w:type="auto" w:w="0"/>
+        <w:tblLook w:firstColumn="1" w:firstRow="1" w:lastColumn="0" w:lastRow="0" w:noHBand="0" w:noVBand="1" w:val="04A0"/>
+      </w:tblPr>
+      <w:tblGrid>
+        <w:gridCol w:w="9972"/>
+      </w:tblGrid>
+      <w:tr>
+        <w:tc>
+          <w:tcPr>
+            <w:tcW w:type="dxa" w:w="9972"/>
+            <w:shd w:val="clear" w:color="auto" w:fill="EAF1FB"/>
+          </w:tcPr>
+          <w:p>
+            <w:r/>
+            <w:r>
+              <w:rPr>
+                <w:b/>
+                <w:color w:val="1F3A5F"/>
+                <w:sz w:val="20"/>
+              </w:rPr>
+              <w:t>[해설] Atlas 증례에서 배울 점</w:t>
+            </w:r>
+          </w:p>
+          <w:p>
+            <w:r>
+              <w:rPr>
+                <w:sz w:val="18"/>
+              </w:rPr>
+              <w:t>• 2a 대부분은 치료 변화로 끝나지만(Unknown 1, 13), 2a에서 3으로 진행하는 재발도 있음(Unknown 11) → 2a 후 직접 관찰·단기 추적을 반드시 연결</w:t>
+            </w:r>
+          </w:p>
+          <w:p>
+            <w:r>
+              <w:rPr>
+                <w:sz w:val="18"/>
+              </w:rPr>
+              <w:t>• N2는 위양성과 위음성이 모두 있음(Unknown 6: 잔존 침샘 / Unknown 14: 잔존 SCC) → 단기 추적이나 PET로 반드시 해결</w:t>
+            </w:r>
+          </w:p>
+          <w:p>
+            <w:r>
+              <w:rPr>
+                <w:sz w:val="18"/>
+              </w:rPr>
+              <w:t>• NI-RADS 3도 생검 음성일 수 있음(Unknown 8) → 생검 음성이어도 추적으로 확인</w:t>
+            </w:r>
+          </w:p>
+          <w:p>
+            <w:r>
+              <w:rPr>
+                <w:sz w:val="18"/>
+              </w:rPr>
+              <w:t>• TORS 후 submandibular gland 일부가 남을 수 있고, 구인두암이 level Ib로 가는 경우는 드묾 (Unknown 6 해설)</w:t>
+            </w:r>
+          </w:p>
+        </w:tc>
+      </w:tr>
+    </w:tbl>
+    <w:p/>
+    <w:p>
+      <w:r>
+        <w:rPr>
+          <w:b w:val="0"/>
+          <w:i/>
+          <w:color w:val="666666"/>
+          <w:sz w:val="17"/>
+        </w:rPr>
+        <w:t>출처: Cavazuti B, Hudgins P, Rath T, Branstetter C, Baugnon K, Corey A, Aiken A. NI-RADS: An Atlas of NI-RADS Categories for Head and Neck Cancer (ACR NI-RADS 웹페이지 자료, 사용자 제공 PDF)</w:t>
+      </w:r>
+    </w:p>
+    <w:p>
+      <w:pPr>
+        <w:spacing w:before="360"/>
+        <w:shd w:val="clear" w:color="auto" w:fill="1F3A5F"/>
+      </w:pPr>
+      <w:r>
+        <w:rPr>
+          <w:b/>
+          <w:i w:val="0"/>
+          <w:color w:val="FFFFFF"/>
+          <w:sz w:val="32"/>
+        </w:rPr>
         <w:t>PART F. 근거와 요약</w:t>
       </w:r>
     </w:p>
@@ -15555,7 +19397,7 @@
           <w:color w:val="1F3A5F"/>
           <w:sz w:val="28"/>
         </w:rPr>
-        <w:t>25. 근거 문헌 요약</w:t>
+        <w:t>27. 근거 문헌 요약</w:t>
       </w:r>
     </w:p>
     <w:tbl>
@@ -15995,7 +19837,7 @@
           <w:color w:val="1F3A5F"/>
           <w:sz w:val="28"/>
         </w:rPr>
-        <w:t>26. 한 장 요약표</w:t>
+        <w:t>28. 한 장 요약표</w:t>
       </w:r>
     </w:p>
     <w:tbl>
@@ -16795,7 +20637,7 @@
           <w:i w:val="0"/>
           <w:sz w:val="20"/>
         </w:rPr>
-        <w:t>ACR 공식 자료 (사용자 제공 PDF)</w:t>
+        <w:t>ACR NI-RADS 공식 사이트 자료 (사용자 제공)</w:t>
       </w:r>
     </w:p>
     <w:p>
@@ -16851,6 +20693,26 @@
     <w:p>
       <w:r>
         <w:rPr>
+          <w:b w:val="0"/>
+          <w:i w:val="0"/>
+          <w:sz w:val="17"/>
+        </w:rPr>
+        <w:t>• Cavazuti B, Hudgins P, Rath T, Branstetter C, Baugnon K, Corey A, Aiken A. NI-RADS: An Atlas of NI-RADS Categories for Head and Neck Cancer (ACR NI-RADS 웹페이지 자료, 사용자 제공 PDF)</w:t>
+      </w:r>
+    </w:p>
+    <w:p>
+      <w:r>
+        <w:rPr>
+          <w:b w:val="0"/>
+          <w:i w:val="0"/>
+          <w:sz w:val="17"/>
+        </w:rPr>
+        <w:t>• NI-RADS 보고서 템플릿·Legend·2018 Committee 추적 권고 (ACR NI-RADS 웹페이지 자료, 사용자 제공 이미지)</w:t>
+      </w:r>
+    </w:p>
+    <w:p>
+      <w:r>
+        <w:rPr>
           <w:b/>
           <w:i w:val="0"/>
           <w:sz w:val="20"/>
@@ -16895,7 +20757,7 @@
           <w:i w:val="0"/>
           <w:sz w:val="17"/>
         </w:rPr>
-        <w:t>4. NI-RADS in posttreatment head and neck cancer surveillance. Cancer Imaging 2026. doi:10.1186/s40644-026-00989-y</w:t>
+        <w:t>4. Zander DA, Aiken AH, Chang YS, et al., Bunch PM. NI-RADS in posttreatment head and neck cancer surveillance: a framework for standardized imaging with clinical impact. Cancer Imaging 2026. doi:10.1186/s40644-026-00989-y</w:t>
       </w:r>
     </w:p>
     <w:p>
@@ -16985,7 +20847,7 @@
           <w:i w:val="0"/>
           <w:sz w:val="17"/>
         </w:rPr>
-        <w:t>13. Vertulli et al. The Role of NI-RADS in the Management of Head and Neck Cancers. Bioengineering 2025. doi:10.3390/bioengineering12040398</w:t>
+        <w:t>13. Vertulli D, Parillo M, Mallio CA. The Role of NI-RADS in the Management of Head and Neck Cancers. Bioengineering 2025. doi:10.3390/bioengineering12040398</w:t>
       </w:r>
     </w:p>
     <w:p>

</xml_diff>

<commit_message>
Clarify NI-RADS baseline timing (8-12 weeks) vs 6-month evidence window
Co-Authored-By: Claude Opus 5.5 <noreply@anthropic.com>
Claude-Session: https://claude.ai/code/session_01BFw33Wx8x4pvzxSmHNQ5Pv
</commit_message>
<xml_diff>
--- a/NI-RADS_통합_학습자료.docx
+++ b/NI-RADS_통합_학습자료.docx
@@ -1549,7 +1549,15 @@
         <w:pStyle w:val="ListBullet"/>
       </w:pPr>
       <w:r>
-        <w:t>치료 후 6개월 이내 영상의 근거가 가장 강함: 12주 PET/CT pooled sensitivity 86.2%, specificity 82.3% (primary)</w:t>
+        <w:t>첫 영상 시점: 근치적 치료 종료 후 8–12주 PET/CECT = post-treatment baseline (CR 확인 후가 아니라, 치료가 끝난 뒤 반응을 판정하는 검사)</w:t>
+      </w:r>
+    </w:p>
+    <w:p>
+      <w:pPr>
+        <w:pStyle w:val="ListBullet"/>
+      </w:pPr>
+      <w:r>
+        <w:t>치료 후 첫 6개월('initial response assessment period')의 영상 근거가 가장 강함 — 예: 12주 PET/CT pooled sensitivity 86.2%, specificity 82.3% (primary). 6개월 이후 장기 추적 영상의 근거는 제한적</w:t>
       </w:r>
     </w:p>
     <w:p>

</xml_diff>

<commit_message>
Revert "Clarify NI-RADS baseline timing (8-12 weeks) vs 6-month evidence window"
Reverted at user's request.

Co-Authored-By: Claude Opus 5.5 <noreply@anthropic.com>
Claude-Session: https://claude.ai/code/session_01BFw33Wx8x4pvzxSmHNQ5Pv
</commit_message>
<xml_diff>
--- a/NI-RADS_통합_학습자료.docx
+++ b/NI-RADS_통합_학습자료.docx
@@ -1549,15 +1549,7 @@
         <w:pStyle w:val="ListBullet"/>
       </w:pPr>
       <w:r>
-        <w:t>첫 영상 시점: 근치적 치료 종료 후 8–12주 PET/CECT = post-treatment baseline (CR 확인 후가 아니라, 치료가 끝난 뒤 반응을 판정하는 검사)</w:t>
-      </w:r>
-    </w:p>
-    <w:p>
-      <w:pPr>
-        <w:pStyle w:val="ListBullet"/>
-      </w:pPr>
-      <w:r>
-        <w:t>치료 후 첫 6개월('initial response assessment period')의 영상 근거가 가장 강함 — 예: 12주 PET/CT pooled sensitivity 86.2%, specificity 82.3% (primary). 6개월 이후 장기 추적 영상의 근거는 제한적</w:t>
+        <w:t>치료 후 6개월 이내 영상의 근거가 가장 강함: 12주 PET/CT pooled sensitivity 86.2%, specificity 82.3% (primary)</w:t>
       </w:r>
     </w:p>
     <w:p>

</xml_diff>